<commit_message>
chore: remove unused pages
</commit_message>
<xml_diff>
--- a/ADTA 4230 Final Project Report.docx
+++ b/ADTA 4230 Final Project Report.docx
@@ -99,7 +99,7 @@
           <w:r>
             <w:fldChar w:fldCharType="separate"/>
           </w:r>
-          <w:hyperlink w:anchor="_Toc235625239" w:history="1">
+          <w:hyperlink w:anchor="_Toc235626546" w:history="1">
             <w:r>
               <w:rPr>
                 <w:rStyle w:val="Hyperlink"/>
@@ -126,7 +126,7 @@
                 <w:noProof/>
                 <w:webHidden/>
               </w:rPr>
-              <w:instrText xml:space="preserve"> PAGEREF _Toc235625239 \h </w:instrText>
+              <w:instrText xml:space="preserve"> PAGEREF _Toc235626546 \h </w:instrText>
             </w:r>
             <w:r>
               <w:rPr>
@@ -170,7 +170,7 @@
               <w14:ligatures w14:val="standardContextual"/>
             </w:rPr>
           </w:pPr>
-          <w:hyperlink w:anchor="_Toc235625240" w:history="1">
+          <w:hyperlink w:anchor="_Toc235626547" w:history="1">
             <w:r>
               <w:rPr>
                 <w:rStyle w:val="Hyperlink"/>
@@ -197,7 +197,7 @@
                 <w:noProof/>
                 <w:webHidden/>
               </w:rPr>
-              <w:instrText xml:space="preserve"> PAGEREF _Toc235625240 \h </w:instrText>
+              <w:instrText xml:space="preserve"> PAGEREF _Toc235626547 \h </w:instrText>
             </w:r>
             <w:r>
               <w:rPr>
@@ -241,7 +241,7 @@
               <w14:ligatures w14:val="standardContextual"/>
             </w:rPr>
           </w:pPr>
-          <w:hyperlink w:anchor="_Toc235625241" w:history="1">
+          <w:hyperlink w:anchor="_Toc235626548" w:history="1">
             <w:r>
               <w:rPr>
                 <w:rStyle w:val="Hyperlink"/>
@@ -268,7 +268,7 @@
                 <w:noProof/>
                 <w:webHidden/>
               </w:rPr>
-              <w:instrText xml:space="preserve"> PAGEREF _Toc235625241 \h </w:instrText>
+              <w:instrText xml:space="preserve"> PAGEREF _Toc235626548 \h </w:instrText>
             </w:r>
             <w:r>
               <w:rPr>
@@ -312,7 +312,7 @@
               <w14:ligatures w14:val="standardContextual"/>
             </w:rPr>
           </w:pPr>
-          <w:hyperlink w:anchor="_Toc235625242" w:history="1">
+          <w:hyperlink w:anchor="_Toc235626549" w:history="1">
             <w:r>
               <w:rPr>
                 <w:rStyle w:val="Hyperlink"/>
@@ -339,7 +339,7 @@
                 <w:noProof/>
                 <w:webHidden/>
               </w:rPr>
-              <w:instrText xml:space="preserve"> PAGEREF _Toc235625242 \h </w:instrText>
+              <w:instrText xml:space="preserve"> PAGEREF _Toc235626549 \h </w:instrText>
             </w:r>
             <w:r>
               <w:rPr>
@@ -383,7 +383,7 @@
               <w14:ligatures w14:val="standardContextual"/>
             </w:rPr>
           </w:pPr>
-          <w:hyperlink w:anchor="_Toc235625243" w:history="1">
+          <w:hyperlink w:anchor="_Toc235626550" w:history="1">
             <w:r>
               <w:rPr>
                 <w:rStyle w:val="Hyperlink"/>
@@ -411,7 +411,7 @@
                 <w:noProof/>
                 <w:webHidden/>
               </w:rPr>
-              <w:instrText xml:space="preserve"> PAGEREF _Toc235625243 \h </w:instrText>
+              <w:instrText xml:space="preserve"> PAGEREF _Toc235626550 \h </w:instrText>
             </w:r>
             <w:r>
               <w:rPr>
@@ -455,7 +455,7 @@
               <w14:ligatures w14:val="standardContextual"/>
             </w:rPr>
           </w:pPr>
-          <w:hyperlink w:anchor="_Toc235625244" w:history="1">
+          <w:hyperlink w:anchor="_Toc235626551" w:history="1">
             <w:r>
               <w:rPr>
                 <w:rStyle w:val="Hyperlink"/>
@@ -483,7 +483,7 @@
                 <w:noProof/>
                 <w:webHidden/>
               </w:rPr>
-              <w:instrText xml:space="preserve"> PAGEREF _Toc235625244 \h </w:instrText>
+              <w:instrText xml:space="preserve"> PAGEREF _Toc235626551 \h </w:instrText>
             </w:r>
             <w:r>
               <w:rPr>
@@ -527,7 +527,7 @@
               <w14:ligatures w14:val="standardContextual"/>
             </w:rPr>
           </w:pPr>
-          <w:hyperlink w:anchor="_Toc235625245" w:history="1">
+          <w:hyperlink w:anchor="_Toc235626552" w:history="1">
             <w:r>
               <w:rPr>
                 <w:rStyle w:val="Hyperlink"/>
@@ -555,7 +555,7 @@
                 <w:noProof/>
                 <w:webHidden/>
               </w:rPr>
-              <w:instrText xml:space="preserve"> PAGEREF _Toc235625245 \h </w:instrText>
+              <w:instrText xml:space="preserve"> PAGEREF _Toc235626552 \h </w:instrText>
             </w:r>
             <w:r>
               <w:rPr>
@@ -599,7 +599,7 @@
               <w14:ligatures w14:val="standardContextual"/>
             </w:rPr>
           </w:pPr>
-          <w:hyperlink w:anchor="_Toc235625246" w:history="1">
+          <w:hyperlink w:anchor="_Toc235626553" w:history="1">
             <w:r>
               <w:rPr>
                 <w:rStyle w:val="Hyperlink"/>
@@ -627,7 +627,7 @@
                 <w:noProof/>
                 <w:webHidden/>
               </w:rPr>
-              <w:instrText xml:space="preserve"> PAGEREF _Toc235625246 \h </w:instrText>
+              <w:instrText xml:space="preserve"> PAGEREF _Toc235626553 \h </w:instrText>
             </w:r>
             <w:r>
               <w:rPr>
@@ -671,7 +671,7 @@
               <w14:ligatures w14:val="standardContextual"/>
             </w:rPr>
           </w:pPr>
-          <w:hyperlink w:anchor="_Toc235625247" w:history="1">
+          <w:hyperlink w:anchor="_Toc235626554" w:history="1">
             <w:r>
               <w:rPr>
                 <w:rStyle w:val="Hyperlink"/>
@@ -699,7 +699,7 @@
                 <w:noProof/>
                 <w:webHidden/>
               </w:rPr>
-              <w:instrText xml:space="preserve"> PAGEREF _Toc235625247 \h </w:instrText>
+              <w:instrText xml:space="preserve"> PAGEREF _Toc235626554 \h </w:instrText>
             </w:r>
             <w:r>
               <w:rPr>
@@ -743,7 +743,7 @@
               <w14:ligatures w14:val="standardContextual"/>
             </w:rPr>
           </w:pPr>
-          <w:hyperlink w:anchor="_Toc235625248" w:history="1">
+          <w:hyperlink w:anchor="_Toc235626555" w:history="1">
             <w:r>
               <w:rPr>
                 <w:rStyle w:val="Hyperlink"/>
@@ -771,7 +771,7 @@
                 <w:noProof/>
                 <w:webHidden/>
               </w:rPr>
-              <w:instrText xml:space="preserve"> PAGEREF _Toc235625248 \h </w:instrText>
+              <w:instrText xml:space="preserve"> PAGEREF _Toc235626555 \h </w:instrText>
             </w:r>
             <w:r>
               <w:rPr>
@@ -815,7 +815,7 @@
               <w14:ligatures w14:val="standardContextual"/>
             </w:rPr>
           </w:pPr>
-          <w:hyperlink w:anchor="_Toc235625249" w:history="1">
+          <w:hyperlink w:anchor="_Toc235626556" w:history="1">
             <w:r>
               <w:rPr>
                 <w:rStyle w:val="Hyperlink"/>
@@ -843,7 +843,7 @@
                 <w:noProof/>
                 <w:webHidden/>
               </w:rPr>
-              <w:instrText xml:space="preserve"> PAGEREF _Toc235625249 \h </w:instrText>
+              <w:instrText xml:space="preserve"> PAGEREF _Toc235626556 \h </w:instrText>
             </w:r>
             <w:r>
               <w:rPr>
@@ -887,7 +887,7 @@
               <w14:ligatures w14:val="standardContextual"/>
             </w:rPr>
           </w:pPr>
-          <w:hyperlink w:anchor="_Toc235625250" w:history="1">
+          <w:hyperlink w:anchor="_Toc235626557" w:history="1">
             <w:r>
               <w:rPr>
                 <w:rStyle w:val="Hyperlink"/>
@@ -915,78 +915,7 @@
                 <w:noProof/>
                 <w:webHidden/>
               </w:rPr>
-              <w:instrText xml:space="preserve"> PAGEREF _Toc235625250 \h </w:instrText>
-            </w:r>
-            <w:r>
-              <w:rPr>
-                <w:noProof/>
-                <w:webHidden/>
-              </w:rPr>
-            </w:r>
-            <w:r>
-              <w:rPr>
-                <w:noProof/>
-                <w:webHidden/>
-              </w:rPr>
-              <w:fldChar w:fldCharType="separate"/>
-            </w:r>
-            <w:r>
-              <w:rPr>
-                <w:noProof/>
-                <w:webHidden/>
-              </w:rPr>
-              <w:t>11</w:t>
-            </w:r>
-            <w:r>
-              <w:rPr>
-                <w:noProof/>
-                <w:webHidden/>
-              </w:rPr>
-              <w:fldChar w:fldCharType="end"/>
-            </w:r>
-          </w:hyperlink>
-        </w:p>
-        <w:p>
-          <w:pPr>
-            <w:pStyle w:val="TOC3"/>
-            <w:tabs>
-              <w:tab w:val="right" w:leader="dot" w:pos="9350"/>
-            </w:tabs>
-            <w:rPr>
-              <w:noProof/>
-              <w:kern w:val="2"/>
-              <w:lang w:eastAsia="en-US"/>
-              <w14:ligatures w14:val="standardContextual"/>
-            </w:rPr>
-          </w:pPr>
-          <w:hyperlink w:anchor="_Toc235625251" w:history="1">
-            <w:r>
-              <w:rPr>
-                <w:rStyle w:val="Hyperlink"/>
-                <w:noProof/>
-              </w:rPr>
-              <w:t>[Heading 3]</w:t>
-            </w:r>
-            <w:r>
-              <w:rPr>
-                <w:noProof/>
-                <w:webHidden/>
-              </w:rPr>
-              <w:tab/>
-            </w:r>
-            <w:r>
-              <w:rPr>
-                <w:noProof/>
-                <w:webHidden/>
-              </w:rPr>
-              <w:fldChar w:fldCharType="begin"/>
-            </w:r>
-            <w:r>
-              <w:rPr>
-                <w:noProof/>
-                <w:webHidden/>
-              </w:rPr>
-              <w:instrText xml:space="preserve"> PAGEREF _Toc235625251 \h </w:instrText>
+              <w:instrText xml:space="preserve"> PAGEREF _Toc235626557 \h </w:instrText>
             </w:r>
             <w:r>
               <w:rPr>
@@ -1030,7 +959,7 @@
               <w14:ligatures w14:val="standardContextual"/>
             </w:rPr>
           </w:pPr>
-          <w:hyperlink w:anchor="_Toc235625252" w:history="1">
+          <w:hyperlink w:anchor="_Toc235626558" w:history="1">
             <w:r>
               <w:rPr>
                 <w:rStyle w:val="Hyperlink"/>
@@ -1057,7 +986,7 @@
                 <w:noProof/>
                 <w:webHidden/>
               </w:rPr>
-              <w:instrText xml:space="preserve"> PAGEREF _Toc235625252 \h </w:instrText>
+              <w:instrText xml:space="preserve"> PAGEREF _Toc235626558 \h </w:instrText>
             </w:r>
             <w:r>
               <w:rPr>
@@ -1077,220 +1006,7 @@
                 <w:noProof/>
                 <w:webHidden/>
               </w:rPr>
-              <w:t>13</w:t>
-            </w:r>
-            <w:r>
-              <w:rPr>
-                <w:noProof/>
-                <w:webHidden/>
-              </w:rPr>
-              <w:fldChar w:fldCharType="end"/>
-            </w:r>
-          </w:hyperlink>
-        </w:p>
-        <w:p>
-          <w:pPr>
-            <w:pStyle w:val="TOC1"/>
-            <w:tabs>
-              <w:tab w:val="right" w:leader="dot" w:pos="9350"/>
-            </w:tabs>
-            <w:rPr>
-              <w:noProof/>
-              <w:kern w:val="2"/>
-              <w:lang w:eastAsia="en-US"/>
-              <w14:ligatures w14:val="standardContextual"/>
-            </w:rPr>
-          </w:pPr>
-          <w:hyperlink w:anchor="_Toc235625253" w:history="1">
-            <w:r>
-              <w:rPr>
-                <w:rStyle w:val="Hyperlink"/>
-                <w:noProof/>
-              </w:rPr>
-              <w:t>Footnotes</w:t>
-            </w:r>
-            <w:r>
-              <w:rPr>
-                <w:noProof/>
-                <w:webHidden/>
-              </w:rPr>
-              <w:tab/>
-            </w:r>
-            <w:r>
-              <w:rPr>
-                <w:noProof/>
-                <w:webHidden/>
-              </w:rPr>
-              <w:fldChar w:fldCharType="begin"/>
-            </w:r>
-            <w:r>
-              <w:rPr>
-                <w:noProof/>
-                <w:webHidden/>
-              </w:rPr>
-              <w:instrText xml:space="preserve"> PAGEREF _Toc235625253 \h </w:instrText>
-            </w:r>
-            <w:r>
-              <w:rPr>
-                <w:noProof/>
-                <w:webHidden/>
-              </w:rPr>
-            </w:r>
-            <w:r>
-              <w:rPr>
-                <w:noProof/>
-                <w:webHidden/>
-              </w:rPr>
-              <w:fldChar w:fldCharType="separate"/>
-            </w:r>
-            <w:r>
-              <w:rPr>
-                <w:noProof/>
-                <w:webHidden/>
-              </w:rPr>
-              <w:t>14</w:t>
-            </w:r>
-            <w:r>
-              <w:rPr>
-                <w:noProof/>
-                <w:webHidden/>
-              </w:rPr>
-              <w:fldChar w:fldCharType="end"/>
-            </w:r>
-          </w:hyperlink>
-        </w:p>
-        <w:p>
-          <w:pPr>
-            <w:pStyle w:val="TOC1"/>
-            <w:tabs>
-              <w:tab w:val="right" w:leader="dot" w:pos="9350"/>
-            </w:tabs>
-            <w:rPr>
-              <w:noProof/>
-              <w:kern w:val="2"/>
-              <w:lang w:eastAsia="en-US"/>
-              <w14:ligatures w14:val="standardContextual"/>
-            </w:rPr>
-          </w:pPr>
-          <w:hyperlink w:anchor="_Toc235625254" w:history="1">
-            <w:r>
-              <w:rPr>
-                <w:rStyle w:val="Hyperlink"/>
-                <w:noProof/>
-              </w:rPr>
-              <w:t>Tables</w:t>
-            </w:r>
-            <w:r>
-              <w:rPr>
-                <w:noProof/>
-                <w:webHidden/>
-              </w:rPr>
-              <w:tab/>
-            </w:r>
-            <w:r>
-              <w:rPr>
-                <w:noProof/>
-                <w:webHidden/>
-              </w:rPr>
-              <w:fldChar w:fldCharType="begin"/>
-            </w:r>
-            <w:r>
-              <w:rPr>
-                <w:noProof/>
-                <w:webHidden/>
-              </w:rPr>
-              <w:instrText xml:space="preserve"> PAGEREF _Toc235625254 \h </w:instrText>
-            </w:r>
-            <w:r>
-              <w:rPr>
-                <w:noProof/>
-                <w:webHidden/>
-              </w:rPr>
-            </w:r>
-            <w:r>
-              <w:rPr>
-                <w:noProof/>
-                <w:webHidden/>
-              </w:rPr>
-              <w:fldChar w:fldCharType="separate"/>
-            </w:r>
-            <w:r>
-              <w:rPr>
-                <w:noProof/>
-                <w:webHidden/>
-              </w:rPr>
-              <w:t>15</w:t>
-            </w:r>
-            <w:r>
-              <w:rPr>
-                <w:noProof/>
-                <w:webHidden/>
-              </w:rPr>
-              <w:fldChar w:fldCharType="end"/>
-            </w:r>
-          </w:hyperlink>
-        </w:p>
-        <w:p>
-          <w:pPr>
-            <w:pStyle w:val="TOC1"/>
-            <w:tabs>
-              <w:tab w:val="right" w:leader="dot" w:pos="9350"/>
-            </w:tabs>
-            <w:rPr>
-              <w:noProof/>
-              <w:kern w:val="2"/>
-              <w:lang w:eastAsia="en-US"/>
-              <w14:ligatures w14:val="standardContextual"/>
-            </w:rPr>
-          </w:pPr>
-          <w:hyperlink w:anchor="_Toc235625255" w:history="1">
-            <w:r>
-              <w:rPr>
-                <w:rStyle w:val="Hyperlink"/>
-                <w:noProof/>
-              </w:rPr>
-              <w:t>Figures</w:t>
-            </w:r>
-            <w:r>
-              <w:rPr>
-                <w:noProof/>
-                <w:webHidden/>
-              </w:rPr>
-              <w:tab/>
-            </w:r>
-            <w:r>
-              <w:rPr>
-                <w:noProof/>
-                <w:webHidden/>
-              </w:rPr>
-              <w:fldChar w:fldCharType="begin"/>
-            </w:r>
-            <w:r>
-              <w:rPr>
-                <w:noProof/>
-                <w:webHidden/>
-              </w:rPr>
-              <w:instrText xml:space="preserve"> PAGEREF _Toc235625255 \h </w:instrText>
-            </w:r>
-            <w:r>
-              <w:rPr>
-                <w:noProof/>
-                <w:webHidden/>
-              </w:rPr>
-            </w:r>
-            <w:r>
-              <w:rPr>
-                <w:noProof/>
-                <w:webHidden/>
-              </w:rPr>
-              <w:fldChar w:fldCharType="separate"/>
-            </w:r>
-            <w:r>
-              <w:rPr>
-                <w:noProof/>
-                <w:webHidden/>
-              </w:rPr>
-              <w:t>16</w:t>
+              <w:t>12</w:t>
             </w:r>
             <w:r>
               <w:rPr>
@@ -1317,7 +1033,7 @@
       </w:sdtContent>
     </w:sdt>
     <w:p/>
-    <w:bookmarkStart w:id="0" w:name="_Toc235625239"/>
+    <w:bookmarkStart w:id="0" w:name="_Toc235626546"/>
     <w:p>
       <w:pPr>
         <w:pStyle w:val="SectionTitle"/>
@@ -1379,7 +1095,7 @@
       <w:pPr>
         <w:pStyle w:val="Heading1"/>
       </w:pPr>
-      <w:bookmarkStart w:id="1" w:name="_Toc235625240"/>
+      <w:bookmarkStart w:id="1" w:name="_Toc235626547"/>
       <w:r>
         <w:t>Data understanding/EDA</w:t>
       </w:r>
@@ -1389,7 +1105,7 @@
       <w:pPr>
         <w:pStyle w:val="Heading2"/>
       </w:pPr>
-      <w:bookmarkStart w:id="2" w:name="_Toc235625241"/>
+      <w:bookmarkStart w:id="2" w:name="_Toc235626548"/>
       <w:r>
         <w:t>Dataset Overview</w:t>
       </w:r>
@@ -1432,7 +1148,7 @@
       <w:pPr>
         <w:pStyle w:val="Heading2"/>
       </w:pPr>
-      <w:bookmarkStart w:id="3" w:name="_Toc235625242"/>
+      <w:bookmarkStart w:id="3" w:name="_Toc235626549"/>
       <w:r>
         <w:t>Missing Data Analysis</w:t>
       </w:r>
@@ -1618,7 +1334,7 @@
           <w:lang w:eastAsia="en-US"/>
         </w:rPr>
       </w:pPr>
-      <w:bookmarkStart w:id="4" w:name="_Toc235625243"/>
+      <w:bookmarkStart w:id="4" w:name="_Toc235626550"/>
       <w:r>
         <w:rPr>
           <w:lang w:eastAsia="en-US"/>
@@ -1730,7 +1446,7 @@
           <w:lang w:eastAsia="en-US"/>
         </w:rPr>
       </w:pPr>
-      <w:bookmarkStart w:id="5" w:name="_Toc235625244"/>
+      <w:bookmarkStart w:id="5" w:name="_Toc235626551"/>
       <w:r>
         <w:rPr>
           <w:lang w:eastAsia="en-US"/>
@@ -1855,7 +1571,7 @@
           <w:lang w:eastAsia="en-US"/>
         </w:rPr>
       </w:pPr>
-      <w:bookmarkStart w:id="6" w:name="_Toc235625245"/>
+      <w:bookmarkStart w:id="6" w:name="_Toc235626552"/>
       <w:r>
         <w:rPr>
           <w:lang w:eastAsia="en-US"/>
@@ -1981,7 +1697,7 @@
           <w:lang w:eastAsia="en-US"/>
         </w:rPr>
       </w:pPr>
-      <w:bookmarkStart w:id="7" w:name="_Toc235625246"/>
+      <w:bookmarkStart w:id="7" w:name="_Toc235626553"/>
       <w:r>
         <w:rPr>
           <w:lang w:eastAsia="en-US"/>
@@ -2101,7 +1817,7 @@
           <w:lang w:eastAsia="en-US"/>
         </w:rPr>
       </w:pPr>
-      <w:bookmarkStart w:id="8" w:name="_Toc235625247"/>
+      <w:bookmarkStart w:id="8" w:name="_Toc235626554"/>
       <w:r>
         <w:rPr>
           <w:lang w:eastAsia="en-US"/>
@@ -2263,7 +1979,7 @@
           <w:lang w:eastAsia="en-US"/>
         </w:rPr>
       </w:pPr>
-      <w:bookmarkStart w:id="9" w:name="_Toc235625248"/>
+      <w:bookmarkStart w:id="9" w:name="_Toc235626555"/>
       <w:r>
         <w:rPr>
           <w:lang w:eastAsia="en-US"/>
@@ -2409,7 +2125,7 @@
           <w:lang w:eastAsia="en-US"/>
         </w:rPr>
       </w:pPr>
-      <w:bookmarkStart w:id="10" w:name="_Toc235625249"/>
+      <w:bookmarkStart w:id="10" w:name="_Toc235626556"/>
       <w:r>
         <w:rPr>
           <w:lang w:eastAsia="en-US"/>
@@ -2529,7 +2245,7 @@
           <w:lang w:eastAsia="en-US"/>
         </w:rPr>
       </w:pPr>
-      <w:bookmarkStart w:id="11" w:name="_Toc235625250"/>
+      <w:bookmarkStart w:id="11" w:name="_Toc235626557"/>
       <w:r>
         <w:rPr>
           <w:lang w:eastAsia="en-US"/>
@@ -2545,253 +2261,7 @@
         </w:rPr>
       </w:pPr>
     </w:p>
-    <w:bookmarkStart w:id="12" w:name="_Toc235625251"/>
-    <w:p>
-      <w:pPr>
-        <w:rPr>
-          <w:b/>
-          <w:bCs/>
-        </w:rPr>
-      </w:pPr>
-      <w:sdt>
-        <w:sdtPr>
-          <w:rPr>
-            <w:rStyle w:val="Heading3Char"/>
-          </w:rPr>
-          <w:id w:val="1751771428"/>
-          <w:placeholder>
-            <w:docPart w:val="9B569ECFE4672044BE3BF43B408B78D3"/>
-          </w:placeholder>
-          <w:temporary/>
-          <w:showingPlcHdr/>
-          <w15:appearance w15:val="hidden"/>
-          <w:text/>
-        </w:sdtPr>
-        <w:sdtEndPr>
-          <w:rPr>
-            <w:rStyle w:val="DefaultParagraphFont"/>
-            <w:rFonts w:asciiTheme="minorHAnsi" w:eastAsiaTheme="minorEastAsia" w:hAnsiTheme="minorHAnsi" w:cstheme="minorBidi"/>
-            <w:b w:val="0"/>
-            <w:bCs w:val="0"/>
-          </w:rPr>
-        </w:sdtEndPr>
-        <w:sdtContent>
-          <w:r>
-            <w:rPr>
-              <w:rStyle w:val="Heading3Char"/>
-            </w:rPr>
-            <w:t>[Heading 3]</w:t>
-          </w:r>
-          <w:bookmarkEnd w:id="12"/>
-        </w:sdtContent>
-      </w:sdt>
-      <w:r>
-        <w:rPr>
-          <w:rStyle w:val="Heading3Char"/>
-        </w:rPr>
-        <w:t xml:space="preserve">. </w:t>
-      </w:r>
-      <w:sdt>
-        <w:sdtPr>
-          <w:id w:val="2054876750"/>
-          <w:placeholder>
-            <w:docPart w:val="2CEEC421EB3E8F49B717BAC366B4492A"/>
-          </w:placeholder>
-          <w:temporary/>
-          <w:showingPlcHdr/>
-          <w15:appearance w15:val="hidden"/>
-          <w:text/>
-        </w:sdtPr>
-        <w:sdtContent>
-          <w:r>
-            <w:t>[Include a period at the end of a run-in heading.  Note that you can include consecutive paragraphs with their own headings, where appropriate.]</w:t>
-          </w:r>
-        </w:sdtContent>
-      </w:sdt>
-    </w:p>
-    <w:p>
-      <w:pPr>
-        <w:rPr>
-          <w:b/>
-          <w:bCs/>
-        </w:rPr>
-      </w:pPr>
-      <w:sdt>
-        <w:sdtPr>
-          <w:rPr>
-            <w:rStyle w:val="Heading4Char"/>
-          </w:rPr>
-          <w:id w:val="-685361587"/>
-          <w:placeholder>
-            <w:docPart w:val="35A156D791984A47BE25D2FEB70E97E8"/>
-          </w:placeholder>
-          <w:temporary/>
-          <w:showingPlcHdr/>
-          <w15:appearance w15:val="hidden"/>
-          <w:text/>
-        </w:sdtPr>
-        <w:sdtEndPr>
-          <w:rPr>
-            <w:rStyle w:val="DefaultParagraphFont"/>
-            <w:rFonts w:asciiTheme="minorHAnsi" w:eastAsiaTheme="minorEastAsia" w:hAnsiTheme="minorHAnsi" w:cstheme="minorBidi"/>
-            <w:b w:val="0"/>
-            <w:bCs w:val="0"/>
-            <w:i w:val="0"/>
-            <w:iCs w:val="0"/>
-          </w:rPr>
-        </w:sdtEndPr>
-        <w:sdtContent>
-          <w:r>
-            <w:rPr>
-              <w:rStyle w:val="Heading4Char"/>
-            </w:rPr>
-            <w:t>[Heading 4]</w:t>
-          </w:r>
-        </w:sdtContent>
-      </w:sdt>
-      <w:r>
-        <w:rPr>
-          <w:rStyle w:val="Heading4Char"/>
-        </w:rPr>
-        <w:t xml:space="preserve">. </w:t>
-      </w:r>
-      <w:sdt>
-        <w:sdtPr>
-          <w:id w:val="-1987159626"/>
-          <w:placeholder>
-            <w:docPart w:val="554653C5B5B9B04EBE5B525E81659628"/>
-          </w:placeholder>
-          <w:temporary/>
-          <w:showingPlcHdr/>
-          <w15:appearance w15:val="hidden"/>
-          <w:text/>
-        </w:sdtPr>
-        <w:sdtContent>
-          <w:r>
-            <w:t>[When using headings, don’t skip levels.  If you need a heading 3, 4, or 5 with no text following it before the next heading, just add a period at the end of the heading and then start a new paragraph for the subheading and its text.]</w:t>
-          </w:r>
-        </w:sdtContent>
-      </w:sdt>
-      <w:r>
-        <w:t xml:space="preserve"> </w:t>
-      </w:r>
-      <w:r>
-        <w:rPr>
-          <w:noProof/>
-        </w:rPr>
-        <w:t xml:space="preserve"> </w:t>
-      </w:r>
-      <w:sdt>
-        <w:sdtPr>
-          <w:rPr>
-            <w:noProof/>
-          </w:rPr>
-          <w:id w:val="642383067"/>
-          <w:placeholder>
-            <w:docPart w:val="7B56FEC57023824F8223A72F9C1D962C"/>
-          </w:placeholder>
-          <w:temporary/>
-          <w:showingPlcHdr/>
-          <w15:appearance w15:val="hidden"/>
-          <w:text/>
-        </w:sdtPr>
-        <w:sdtContent>
-          <w:r>
-            <w:rPr>
-              <w:noProof/>
-            </w:rPr>
-            <w:t>(Last Name, Year)</w:t>
-          </w:r>
-        </w:sdtContent>
-      </w:sdt>
-    </w:p>
-    <w:p>
-      <w:sdt>
-        <w:sdtPr>
-          <w:rPr>
-            <w:rStyle w:val="Heading5Char"/>
-          </w:rPr>
-          <w:id w:val="-53853956"/>
-          <w:placeholder>
-            <w:docPart w:val="A9B80FFE705488468CB3A6035A940C55"/>
-          </w:placeholder>
-          <w:temporary/>
-          <w:showingPlcHdr/>
-          <w15:appearance w15:val="hidden"/>
-          <w:text/>
-        </w:sdtPr>
-        <w:sdtEndPr>
-          <w:rPr>
-            <w:rStyle w:val="DefaultParagraphFont"/>
-            <w:rFonts w:asciiTheme="minorHAnsi" w:eastAsiaTheme="minorEastAsia" w:hAnsiTheme="minorHAnsi" w:cstheme="minorBidi"/>
-            <w:i w:val="0"/>
-            <w:iCs w:val="0"/>
-          </w:rPr>
-        </w:sdtEndPr>
-        <w:sdtContent>
-          <w:r>
-            <w:rPr>
-              <w:rStyle w:val="Heading5Char"/>
-            </w:rPr>
-            <w:t>[Heading 5]</w:t>
-          </w:r>
-        </w:sdtContent>
-      </w:sdt>
-      <w:r>
-        <w:rPr>
-          <w:rStyle w:val="Heading5Char"/>
-        </w:rPr>
-        <w:t xml:space="preserve">. </w:t>
-      </w:r>
-      <w:sdt>
-        <w:sdtPr>
-          <w:id w:val="1216239889"/>
-          <w:placeholder>
-            <w:docPart w:val="C96ADC24F88B144FAE13AADE8A145973"/>
-          </w:placeholder>
-          <w:temporary/>
-          <w:showingPlcHdr/>
-          <w15:appearance w15:val="hidden"/>
-          <w:text/>
-        </w:sdtPr>
-        <w:sdtContent>
-          <w:r>
-            <w:t xml:space="preserve">[Like all sections of your paper, references start on their own page, as shown on the page that follows.  The body of the References section uses the Bibliography style.  </w:t>
-          </w:r>
-          <w:r>
-            <w:lastRenderedPageBreak/>
-            <w:t>For more detailed information on formatting references, see the APA Style Manual, 6th Edition.</w:t>
-          </w:r>
-        </w:sdtContent>
-      </w:sdt>
-      <w:r>
-        <w:t xml:space="preserve">  </w:t>
-      </w:r>
-      <w:sdt>
-        <w:sdtPr>
-          <w:rPr>
-            <w:noProof/>
-          </w:rPr>
-          <w:id w:val="-666327084"/>
-          <w:placeholder>
-            <w:docPart w:val="9CA9D4979D2E3D4A869F47F97AB32CC8"/>
-          </w:placeholder>
-          <w:temporary/>
-          <w:showingPlcHdr/>
-          <w15:appearance w15:val="hidden"/>
-          <w:text/>
-        </w:sdtPr>
-        <w:sdtContent>
-          <w:r>
-            <w:rPr>
-              <w:noProof/>
-            </w:rPr>
-            <w:t>(Last Name, Year)</w:t>
-          </w:r>
-        </w:sdtContent>
-      </w:sdt>
-    </w:p>
-    <w:bookmarkStart w:id="13" w:name="_Toc235625252" w:displacedByCustomXml="next"/>
+    <w:bookmarkStart w:id="12" w:name="_Toc235626558" w:displacedByCustomXml="next"/>
     <w:sdt>
       <w:sdtPr>
         <w:rPr>
@@ -2808,7 +2278,7 @@
           <w:r>
             <w:t>References</w:t>
           </w:r>
-          <w:bookmarkEnd w:id="13"/>
+          <w:bookmarkEnd w:id="12"/>
         </w:p>
         <w:sdt>
           <w:sdtPr>
@@ -2880,739 +2350,11 @@
     </w:sdt>
     <w:p>
       <w:pPr>
-        <w:pStyle w:val="SectionTitle"/>
-      </w:pPr>
-      <w:bookmarkStart w:id="14" w:name="_Toc235625253"/>
-      <w:r>
-        <w:lastRenderedPageBreak/>
-        <w:t>Footnotes</w:t>
-      </w:r>
-      <w:bookmarkEnd w:id="14"/>
-    </w:p>
-    <w:p>
-      <w:r>
-        <w:rPr>
-          <w:rStyle w:val="FootnoteReference"/>
-        </w:rPr>
-        <w:t>1</w:t>
-      </w:r>
-      <w:sdt>
-        <w:sdtPr>
-          <w:id w:val="1069077422"/>
-          <w:placeholder>
-            <w:docPart w:val="D9894D6E0CB39148A644FA0F37967BB9"/>
-          </w:placeholder>
-          <w:temporary/>
-          <w:showingPlcHdr/>
-          <w15:appearance w15:val="hidden"/>
-          <w:text/>
-        </w:sdtPr>
-        <w:sdtEndPr>
-          <w:rPr>
-            <w:rStyle w:val="FootnoteReference"/>
-            <w:vertAlign w:val="superscript"/>
-          </w:rPr>
-        </w:sdtEndPr>
-        <w:sdtContent>
-          <w:r>
-            <w:t xml:space="preserve">[Add footnotes, if any, on their own page following references.  For APA formatting requirements, it’s easy to just type your own footnote references and notes.  To format a footnote reference, select the number and then apply the Footnote Reference.  The body of a footnote, such as this example, uses the Normal text style.  </w:t>
-          </w:r>
-          <w:r>
-            <w:rPr>
-              <w:rStyle w:val="Emphasis"/>
-            </w:rPr>
-            <w:t>(Note:  If you delete this sample footnote, don’t forget to delete its in-text reference as well.)</w:t>
-          </w:r>
-          <w:r>
-            <w:t>]</w:t>
-          </w:r>
-        </w:sdtContent>
-      </w:sdt>
-    </w:p>
-    <w:p>
-      <w:pPr>
-        <w:pStyle w:val="SectionTitle"/>
-      </w:pPr>
-      <w:bookmarkStart w:id="15" w:name="_Toc235625254"/>
-      <w:r>
-        <w:lastRenderedPageBreak/>
-        <w:t>Tables</w:t>
-      </w:r>
-      <w:bookmarkEnd w:id="15"/>
-    </w:p>
-    <w:p>
-      <w:pPr>
-        <w:pStyle w:val="NoSpacing"/>
-      </w:pPr>
-      <w:r>
-        <w:t>Table 1</w:t>
-      </w:r>
-    </w:p>
-    <w:sdt>
-      <w:sdtPr>
-        <w:rPr>
-          <w:rStyle w:val="Emphasis"/>
-        </w:rPr>
-        <w:id w:val="1042324137"/>
-        <w:placeholder>
-          <w:docPart w:val="F15817FC0AD49D4E93CE56ED735161D3"/>
-        </w:placeholder>
-        <w:temporary/>
-        <w:showingPlcHdr/>
-        <w15:appearance w15:val="hidden"/>
-        <w:text/>
-      </w:sdtPr>
-      <w:sdtEndPr>
-        <w:rPr>
-          <w:rStyle w:val="DefaultParagraphFont"/>
-          <w:i w:val="0"/>
-          <w:iCs w:val="0"/>
-        </w:rPr>
-      </w:sdtEndPr>
-      <w:sdtContent>
-        <w:p>
-          <w:pPr>
-            <w:pStyle w:val="NoSpacing"/>
-          </w:pPr>
-          <w:r>
-            <w:rPr>
-              <w:rStyle w:val="Emphasis"/>
-            </w:rPr>
-            <w:t>[Table Title]</w:t>
-          </w:r>
-        </w:p>
-      </w:sdtContent>
-    </w:sdt>
-    <w:tbl>
-      <w:tblPr>
-        <w:tblStyle w:val="APAReport"/>
-        <w:tblW w:w="5000" w:type="pct"/>
-        <w:tblLook w:val="04A0" w:firstRow="1" w:lastRow="0" w:firstColumn="1" w:lastColumn="0" w:noHBand="0" w:noVBand="1"/>
-        <w:tblCaption w:val="Sample 5-column table"/>
-      </w:tblPr>
-      <w:tblGrid>
-        <w:gridCol w:w="1874"/>
-        <w:gridCol w:w="1872"/>
-        <w:gridCol w:w="1872"/>
-        <w:gridCol w:w="1872"/>
-        <w:gridCol w:w="1870"/>
-      </w:tblGrid>
-      <w:tr>
-        <w:trPr>
-          <w:cnfStyle w:val="100000000000" w:firstRow="1" w:lastRow="0" w:firstColumn="0" w:lastColumn="0" w:oddVBand="0" w:evenVBand="0" w:oddHBand="0" w:evenHBand="0" w:firstRowFirstColumn="0" w:firstRowLastColumn="0" w:lastRowFirstColumn="0" w:lastRowLastColumn="0"/>
-        </w:trPr>
-        <w:tc>
-          <w:tcPr>
-            <w:tcW w:w="1001" w:type="pct"/>
-          </w:tcPr>
-          <w:p>
-            <w:pPr>
-              <w:pStyle w:val="NoSpacing"/>
-            </w:pPr>
-            <w:r>
-              <w:t>Column Head</w:t>
-            </w:r>
-          </w:p>
-        </w:tc>
-        <w:tc>
-          <w:tcPr>
-            <w:tcW w:w="1000" w:type="pct"/>
-          </w:tcPr>
-          <w:p>
-            <w:pPr>
-              <w:pStyle w:val="NoSpacing"/>
-            </w:pPr>
-            <w:r>
-              <w:t>Column Head</w:t>
-            </w:r>
-          </w:p>
-        </w:tc>
-        <w:tc>
-          <w:tcPr>
-            <w:tcW w:w="1000" w:type="pct"/>
-          </w:tcPr>
-          <w:p>
-            <w:pPr>
-              <w:pStyle w:val="NoSpacing"/>
-            </w:pPr>
-            <w:r>
-              <w:t>Column Head</w:t>
-            </w:r>
-          </w:p>
-        </w:tc>
-        <w:tc>
-          <w:tcPr>
-            <w:tcW w:w="1000" w:type="pct"/>
-          </w:tcPr>
-          <w:p>
-            <w:pPr>
-              <w:pStyle w:val="NoSpacing"/>
-            </w:pPr>
-            <w:r>
-              <w:t>Column Head</w:t>
-            </w:r>
-          </w:p>
-        </w:tc>
-        <w:tc>
-          <w:tcPr>
-            <w:tcW w:w="999" w:type="pct"/>
-          </w:tcPr>
-          <w:p>
-            <w:pPr>
-              <w:pStyle w:val="NoSpacing"/>
-            </w:pPr>
-            <w:r>
-              <w:t>Column Head</w:t>
-            </w:r>
-          </w:p>
-        </w:tc>
-      </w:tr>
-      <w:tr>
-        <w:tc>
-          <w:tcPr>
-            <w:tcW w:w="1001" w:type="pct"/>
-          </w:tcPr>
-          <w:p>
-            <w:pPr>
-              <w:pStyle w:val="NoSpacing"/>
-            </w:pPr>
-            <w:r>
-              <w:t>Row Head</w:t>
-            </w:r>
-          </w:p>
-        </w:tc>
-        <w:tc>
-          <w:tcPr>
-            <w:tcW w:w="1000" w:type="pct"/>
-          </w:tcPr>
-          <w:p>
-            <w:pPr>
-              <w:pStyle w:val="NoSpacing"/>
-            </w:pPr>
-            <w:r>
-              <w:t>123</w:t>
-            </w:r>
-          </w:p>
-        </w:tc>
-        <w:tc>
-          <w:tcPr>
-            <w:tcW w:w="1000" w:type="pct"/>
-          </w:tcPr>
-          <w:p>
-            <w:pPr>
-              <w:pStyle w:val="NoSpacing"/>
-            </w:pPr>
-            <w:r>
-              <w:t>123</w:t>
-            </w:r>
-          </w:p>
-        </w:tc>
-        <w:tc>
-          <w:tcPr>
-            <w:tcW w:w="1000" w:type="pct"/>
-          </w:tcPr>
-          <w:p>
-            <w:pPr>
-              <w:pStyle w:val="NoSpacing"/>
-            </w:pPr>
-            <w:r>
-              <w:t>123</w:t>
-            </w:r>
-          </w:p>
-        </w:tc>
-        <w:tc>
-          <w:tcPr>
-            <w:tcW w:w="999" w:type="pct"/>
-          </w:tcPr>
-          <w:p>
-            <w:pPr>
-              <w:pStyle w:val="NoSpacing"/>
-            </w:pPr>
-            <w:r>
-              <w:t>123</w:t>
-            </w:r>
-          </w:p>
-        </w:tc>
-      </w:tr>
-      <w:tr>
-        <w:tc>
-          <w:tcPr>
-            <w:tcW w:w="1001" w:type="pct"/>
-          </w:tcPr>
-          <w:p>
-            <w:pPr>
-              <w:pStyle w:val="NoSpacing"/>
-            </w:pPr>
-            <w:r>
-              <w:t>Row Head</w:t>
-            </w:r>
-          </w:p>
-        </w:tc>
-        <w:tc>
-          <w:tcPr>
-            <w:tcW w:w="1000" w:type="pct"/>
-          </w:tcPr>
-          <w:p>
-            <w:pPr>
-              <w:pStyle w:val="NoSpacing"/>
-            </w:pPr>
-            <w:r>
-              <w:t>456</w:t>
-            </w:r>
-          </w:p>
-        </w:tc>
-        <w:tc>
-          <w:tcPr>
-            <w:tcW w:w="1000" w:type="pct"/>
-          </w:tcPr>
-          <w:p>
-            <w:pPr>
-              <w:pStyle w:val="NoSpacing"/>
-            </w:pPr>
-            <w:r>
-              <w:t>456</w:t>
-            </w:r>
-          </w:p>
-        </w:tc>
-        <w:tc>
-          <w:tcPr>
-            <w:tcW w:w="1000" w:type="pct"/>
-          </w:tcPr>
-          <w:p>
-            <w:pPr>
-              <w:pStyle w:val="NoSpacing"/>
-            </w:pPr>
-            <w:r>
-              <w:t>456</w:t>
-            </w:r>
-          </w:p>
-        </w:tc>
-        <w:tc>
-          <w:tcPr>
-            <w:tcW w:w="999" w:type="pct"/>
-          </w:tcPr>
-          <w:p>
-            <w:pPr>
-              <w:pStyle w:val="NoSpacing"/>
-            </w:pPr>
-            <w:r>
-              <w:t>456</w:t>
-            </w:r>
-          </w:p>
-        </w:tc>
-      </w:tr>
-      <w:tr>
-        <w:tc>
-          <w:tcPr>
-            <w:tcW w:w="1001" w:type="pct"/>
-          </w:tcPr>
-          <w:p>
-            <w:pPr>
-              <w:pStyle w:val="NoSpacing"/>
-            </w:pPr>
-            <w:r>
-              <w:t>Row Head</w:t>
-            </w:r>
-          </w:p>
-        </w:tc>
-        <w:tc>
-          <w:tcPr>
-            <w:tcW w:w="1000" w:type="pct"/>
-          </w:tcPr>
-          <w:p>
-            <w:pPr>
-              <w:pStyle w:val="NoSpacing"/>
-            </w:pPr>
-            <w:r>
-              <w:t>789</w:t>
-            </w:r>
-          </w:p>
-        </w:tc>
-        <w:tc>
-          <w:tcPr>
-            <w:tcW w:w="1000" w:type="pct"/>
-          </w:tcPr>
-          <w:p>
-            <w:pPr>
-              <w:pStyle w:val="NoSpacing"/>
-            </w:pPr>
-            <w:r>
-              <w:t>789</w:t>
-            </w:r>
-          </w:p>
-        </w:tc>
-        <w:tc>
-          <w:tcPr>
-            <w:tcW w:w="1000" w:type="pct"/>
-          </w:tcPr>
-          <w:p>
-            <w:pPr>
-              <w:pStyle w:val="NoSpacing"/>
-            </w:pPr>
-            <w:r>
-              <w:t>789</w:t>
-            </w:r>
-          </w:p>
-        </w:tc>
-        <w:tc>
-          <w:tcPr>
-            <w:tcW w:w="999" w:type="pct"/>
-          </w:tcPr>
-          <w:p>
-            <w:pPr>
-              <w:pStyle w:val="NoSpacing"/>
-            </w:pPr>
-            <w:r>
-              <w:t>789</w:t>
-            </w:r>
-          </w:p>
-        </w:tc>
-      </w:tr>
-      <w:tr>
-        <w:tc>
-          <w:tcPr>
-            <w:tcW w:w="1001" w:type="pct"/>
-          </w:tcPr>
-          <w:p>
-            <w:pPr>
-              <w:pStyle w:val="NoSpacing"/>
-            </w:pPr>
-            <w:r>
-              <w:t>Row Head</w:t>
-            </w:r>
-          </w:p>
-        </w:tc>
-        <w:tc>
-          <w:tcPr>
-            <w:tcW w:w="1000" w:type="pct"/>
-          </w:tcPr>
-          <w:p>
-            <w:pPr>
-              <w:pStyle w:val="NoSpacing"/>
-            </w:pPr>
-            <w:r>
-              <w:t>123</w:t>
-            </w:r>
-          </w:p>
-        </w:tc>
-        <w:tc>
-          <w:tcPr>
-            <w:tcW w:w="1000" w:type="pct"/>
-          </w:tcPr>
-          <w:p>
-            <w:pPr>
-              <w:pStyle w:val="NoSpacing"/>
-            </w:pPr>
-            <w:r>
-              <w:t>123</w:t>
-            </w:r>
-          </w:p>
-        </w:tc>
-        <w:tc>
-          <w:tcPr>
-            <w:tcW w:w="1000" w:type="pct"/>
-          </w:tcPr>
-          <w:p>
-            <w:pPr>
-              <w:pStyle w:val="NoSpacing"/>
-            </w:pPr>
-            <w:r>
-              <w:t>123</w:t>
-            </w:r>
-          </w:p>
-        </w:tc>
-        <w:tc>
-          <w:tcPr>
-            <w:tcW w:w="999" w:type="pct"/>
-          </w:tcPr>
-          <w:p>
-            <w:pPr>
-              <w:pStyle w:val="NoSpacing"/>
-            </w:pPr>
-            <w:r>
-              <w:t>123</w:t>
-            </w:r>
-          </w:p>
-        </w:tc>
-      </w:tr>
-      <w:tr>
-        <w:tc>
-          <w:tcPr>
-            <w:tcW w:w="1001" w:type="pct"/>
-          </w:tcPr>
-          <w:p>
-            <w:pPr>
-              <w:pStyle w:val="NoSpacing"/>
-            </w:pPr>
-            <w:r>
-              <w:t>Row Head</w:t>
-            </w:r>
-          </w:p>
-        </w:tc>
-        <w:tc>
-          <w:tcPr>
-            <w:tcW w:w="1000" w:type="pct"/>
-          </w:tcPr>
-          <w:p>
-            <w:pPr>
-              <w:pStyle w:val="NoSpacing"/>
-            </w:pPr>
-            <w:r>
-              <w:t>456</w:t>
-            </w:r>
-          </w:p>
-        </w:tc>
-        <w:tc>
-          <w:tcPr>
-            <w:tcW w:w="1000" w:type="pct"/>
-          </w:tcPr>
-          <w:p>
-            <w:pPr>
-              <w:pStyle w:val="NoSpacing"/>
-            </w:pPr>
-            <w:r>
-              <w:t>456</w:t>
-            </w:r>
-          </w:p>
-        </w:tc>
-        <w:tc>
-          <w:tcPr>
-            <w:tcW w:w="1000" w:type="pct"/>
-          </w:tcPr>
-          <w:p>
-            <w:pPr>
-              <w:pStyle w:val="NoSpacing"/>
-            </w:pPr>
-            <w:r>
-              <w:t>456</w:t>
-            </w:r>
-          </w:p>
-        </w:tc>
-        <w:tc>
-          <w:tcPr>
-            <w:tcW w:w="999" w:type="pct"/>
-          </w:tcPr>
-          <w:p>
-            <w:pPr>
-              <w:pStyle w:val="NoSpacing"/>
-            </w:pPr>
-            <w:r>
-              <w:t>456</w:t>
-            </w:r>
-          </w:p>
-        </w:tc>
-      </w:tr>
-      <w:tr>
-        <w:tc>
-          <w:tcPr>
-            <w:tcW w:w="1001" w:type="pct"/>
-          </w:tcPr>
-          <w:p>
-            <w:pPr>
-              <w:pStyle w:val="NoSpacing"/>
-            </w:pPr>
-            <w:r>
-              <w:t>Row Head</w:t>
-            </w:r>
-          </w:p>
-        </w:tc>
-        <w:tc>
-          <w:tcPr>
-            <w:tcW w:w="1000" w:type="pct"/>
-          </w:tcPr>
-          <w:p>
-            <w:pPr>
-              <w:pStyle w:val="NoSpacing"/>
-            </w:pPr>
-            <w:r>
-              <w:t>789</w:t>
-            </w:r>
-          </w:p>
-        </w:tc>
-        <w:tc>
-          <w:tcPr>
-            <w:tcW w:w="1000" w:type="pct"/>
-          </w:tcPr>
-          <w:p>
-            <w:pPr>
-              <w:pStyle w:val="NoSpacing"/>
-            </w:pPr>
-            <w:r>
-              <w:t>789</w:t>
-            </w:r>
-          </w:p>
-        </w:tc>
-        <w:tc>
-          <w:tcPr>
-            <w:tcW w:w="1000" w:type="pct"/>
-          </w:tcPr>
-          <w:p>
-            <w:pPr>
-              <w:pStyle w:val="NoSpacing"/>
-            </w:pPr>
-            <w:r>
-              <w:t>789</w:t>
-            </w:r>
-          </w:p>
-        </w:tc>
-        <w:tc>
-          <w:tcPr>
-            <w:tcW w:w="999" w:type="pct"/>
-          </w:tcPr>
-          <w:p>
-            <w:pPr>
-              <w:pStyle w:val="NoSpacing"/>
-            </w:pPr>
-            <w:r>
-              <w:t>789</w:t>
-            </w:r>
-          </w:p>
-        </w:tc>
-      </w:tr>
-    </w:tbl>
-    <w:p>
-      <w:pPr>
         <w:pStyle w:val="TableFigure"/>
       </w:pPr>
-      <w:r>
-        <w:rPr>
-          <w:rStyle w:val="Emphasis"/>
-        </w:rPr>
-        <w:t>Note</w:t>
-      </w:r>
-      <w:r>
-        <w:t xml:space="preserve">:  </w:t>
-      </w:r>
-      <w:sdt>
-        <w:sdtPr>
-          <w:id w:val="668988805"/>
-          <w:placeholder>
-            <w:docPart w:val="6DC6EECFD59EFE4DB586016C1C9CDE89"/>
-          </w:placeholder>
-          <w:temporary/>
-          <w:showingPlcHdr/>
-          <w15:appearance w15:val="hidden"/>
-        </w:sdtPr>
-        <w:sdtContent>
-          <w:r>
-            <w:t>[Place all tables for your paper in a tables section, following references (and, if applicable, footnotes).  Start a new page for each table, include a table number and table title for each, as shown on this page.  All explanatory text appears in a table note that follows the table, such as this one.  Use the Table/Figure style to get the spacing between table and note.  Tables in APA format can use single or 1.5 line spacing.  Include a heading for every row and column, even if the content seems obvious.  To insert a table, on the Insert tab, tap Table.  New tables that you create in this document use APA format by default.]</w:t>
-          </w:r>
-        </w:sdtContent>
-      </w:sdt>
-    </w:p>
-    <w:p>
-      <w:pPr>
-        <w:pStyle w:val="SectionTitle"/>
-      </w:pPr>
-      <w:bookmarkStart w:id="16" w:name="_Toc235625255"/>
-      <w:r>
-        <w:lastRenderedPageBreak/>
-        <w:t>Figures</w:t>
-      </w:r>
-      <w:bookmarkEnd w:id="16"/>
-    </w:p>
-    <w:p>
-      <w:pPr>
-        <w:pStyle w:val="NoSpacing"/>
-      </w:pPr>
-      <w:r>
-        <w:rPr>
-          <w:noProof/>
-          <w:lang w:eastAsia="en-US"/>
-        </w:rPr>
-        <w:drawing>
-          <wp:inline distT="0" distB="0" distL="0" distR="0" wp14:anchorId="209CD757" wp14:editId="3BFDE15F">
-            <wp:extent cx="5934075" cy="3956051"/>
-            <wp:effectExtent l="0" t="0" r="0" b="6350"/>
-            <wp:docPr id="2" name="Picture 2" title="Fish and colorful coral"/>
-            <wp:cNvGraphicFramePr>
-              <a:graphicFrameLocks xmlns:a="http://schemas.openxmlformats.org/drawingml/2006/main" noChangeAspect="1"/>
-            </wp:cNvGraphicFramePr>
-            <a:graphic xmlns:a="http://schemas.openxmlformats.org/drawingml/2006/main">
-              <a:graphicData uri="http://schemas.openxmlformats.org/drawingml/2006/picture">
-                <pic:pic xmlns:pic="http://schemas.openxmlformats.org/drawingml/2006/picture">
-                  <pic:nvPicPr>
-                    <pic:cNvPr id="2" name="Fish_96ppi.png"/>
-                    <pic:cNvPicPr/>
-                  </pic:nvPicPr>
-                  <pic:blipFill>
-                    <a:blip r:embed="rId16">
-                      <a:extLst>
-                        <a:ext uri="{28A0092B-C50C-407E-A947-70E740481C1C}">
-                          <a14:useLocalDpi xmlns:a14="http://schemas.microsoft.com/office/drawing/2010/main" val="0"/>
-                        </a:ext>
-                      </a:extLst>
-                    </a:blip>
-                    <a:stretch>
-                      <a:fillRect/>
-                    </a:stretch>
-                  </pic:blipFill>
-                  <pic:spPr>
-                    <a:xfrm>
-                      <a:off x="0" y="0"/>
-                      <a:ext cx="5935782" cy="3957189"/>
-                    </a:xfrm>
-                    <a:prstGeom prst="rect">
-                      <a:avLst/>
-                    </a:prstGeom>
-                  </pic:spPr>
-                </pic:pic>
-              </a:graphicData>
-            </a:graphic>
-          </wp:inline>
-        </w:drawing>
-      </w:r>
-    </w:p>
-    <w:p>
-      <w:pPr>
-        <w:pStyle w:val="TOCHeading"/>
-      </w:pPr>
-      <w:r>
-        <w:rPr>
-          <w:rStyle w:val="Emphasis"/>
-        </w:rPr>
-        <w:lastRenderedPageBreak/>
-        <w:t>Figure 1</w:t>
-      </w:r>
-      <w:r>
-        <w:t xml:space="preserve">. </w:t>
-      </w:r>
-      <w:sdt>
-        <w:sdtPr>
-          <w:id w:val="1420302148"/>
-          <w:placeholder>
-            <w:docPart w:val="07E172FFE7C59D46AC065BEE4DA0BD59"/>
-          </w:placeholder>
-          <w:temporary/>
-          <w:showingPlcHdr/>
-          <w15:appearance w15:val="hidden"/>
-          <w:text/>
-        </w:sdtPr>
-        <w:sdtContent>
-          <w:r>
-            <w:t>[Include all figures in their own section, following references (and footnotes and tables, if applicable).  Include a numbered caption for each figure.  Use the Table/Figure style for easy spacing between figure and caption.]</w:t>
-          </w:r>
-        </w:sdtContent>
-      </w:sdt>
-    </w:p>
-    <w:p>
-      <w:pPr>
-        <w:pStyle w:val="TableFigure"/>
-      </w:pPr>
-      <w:r>
-        <w:t xml:space="preserve">For more information about all elements of APA formatting, please consult the </w:t>
-      </w:r>
-      <w:r>
-        <w:rPr>
-          <w:rStyle w:val="Emphasis"/>
-        </w:rPr>
-        <w:t>APA Style Manual, 6th Edition</w:t>
-      </w:r>
-      <w:r>
-        <w:t>.</w:t>
-      </w:r>
     </w:p>
     <w:sectPr>
+      <w:headerReference w:type="even" r:id="rId16"/>
       <w:headerReference w:type="default" r:id="rId17"/>
       <w:headerReference w:type="first" r:id="rId18"/>
       <w:footnotePr>
@@ -3681,90 +2423,131 @@
 
 <file path=word/header1.xml><?xml version="1.0" encoding="utf-8"?>
 <w:hdr xmlns:wpc="http://schemas.microsoft.com/office/word/2010/wordprocessingCanvas" xmlns:cx="http://schemas.microsoft.com/office/drawing/2014/chartex" xmlns:cx1="http://schemas.microsoft.com/office/drawing/2015/9/8/chartex" xmlns:cx2="http://schemas.microsoft.com/office/drawing/2015/10/21/chartex" xmlns:cx3="http://schemas.microsoft.com/office/drawing/2016/5/9/chartex" xmlns:cx4="http://schemas.microsoft.com/office/drawing/2016/5/10/chartex" xmlns:cx5="http://schemas.microsoft.com/office/drawing/2016/5/11/chartex" xmlns:cx6="http://schemas.microsoft.com/office/drawing/2016/5/12/chartex" xmlns:cx7="http://schemas.microsoft.com/office/drawing/2016/5/13/chartex" xmlns:cx8="http://schemas.microsoft.com/office/drawing/2016/5/14/chartex" xmlns:mc="http://schemas.openxmlformats.org/markup-compatibility/2006" xmlns:m="http://schemas.openxmlformats.org/officeDocument/2006/math" xmlns:aink="http://schemas.microsoft.com/office/drawing/2016/ink" xmlns:am3d="http://schemas.microsoft.com/office/drawing/2017/model3d" xmlns:oel="http://schemas.microsoft.com/office/2019/extlst" xmlns:r="http://schemas.openxmlformats.org/officeDocument/2006/relationships" xmlns:wp14="http://schemas.microsoft.com/office/word/2010/wordprocessingDrawing" xmlns:wp="http://schemas.openxmlformats.org/drawingml/2006/wordprocessingDrawing" xmlns:wpg="http://schemas.microsoft.com/office/word/2010/wordprocessingGroup" xmlns:wpi="http://schemas.microsoft.com/office/word/2010/wordprocessingInk" xmlns:wps="http://schemas.microsoft.com/office/word/2010/wordprocessingShape" xmlns:o="urn:schemas-microsoft-com:office:office" xmlns:v="urn:schemas-microsoft-com:vml" xmlns:w10="urn:schemas-microsoft-com:office:word" xmlns:w="http://schemas.openxmlformats.org/wordprocessingml/2006/main" xmlns:w14="http://schemas.microsoft.com/office/word/2010/wordml" xmlns:w15="http://schemas.microsoft.com/office/word/2012/wordml" xmlns:w16cei="http://schemas.microsoft.com/office/word/2026/wordml/cei" xmlns:w16cex="http://schemas.microsoft.com/office/word/2018/wordml/cex" xmlns:w16cid="http://schemas.microsoft.com/office/word/2016/wordml/cid" xmlns:w16="http://schemas.microsoft.com/office/word/2018/wordml" xmlns:w16sdtdh="http://schemas.microsoft.com/office/word/2020/wordml/sdtdatahash" xmlns:w16sdtfl="http://schemas.microsoft.com/office/word/2024/wordml/sdtformatlock" xmlns:w16se="http://schemas.microsoft.com/office/word/2015/wordml/symex" xmlns:w16du="http://schemas.microsoft.com/office/word/2023/wordml/word16du" xmlns:wne="http://schemas.microsoft.com/office/word/2006/wordml" mc:Ignorable="w14 w15 w16se w16cid w16 w16cex w16sdtdh w16sdtfl w16du wp14">
-  <w:p>
-    <w:pPr>
-      <w:pStyle w:val="Header"/>
-    </w:pPr>
-    <w:sdt>
-      <w:sdtPr>
-        <w:rPr>
-          <w:rStyle w:val="Strong"/>
-        </w:rPr>
-        <w:alias w:val="Running head"/>
-        <w:tag w:val=""/>
-        <w:id w:val="1072628492"/>
-        <w:placeholder>
-          <w:docPart w:val="6DC6EECFD59EFE4DB586016C1C9CDE89"/>
-        </w:placeholder>
-        <w:showingPlcHdr/>
-        <w:dataBinding w:prefixMappings="xmlns:ns0='http://schemas.microsoft.com/office/2006/coverPageProps' " w:xpath="/ns0:CoverPageProperties[1]/ns0:Abstract[1]" w:storeItemID="{55AF091B-3C7A-41E3-B477-F2FDAA23CFDA}"/>
-        <w15:appearance w15:val="hidden"/>
-        <w:text/>
-      </w:sdtPr>
-      <w:sdtEndPr>
-        <w:rPr>
-          <w:rStyle w:val="DefaultParagraphFont"/>
-          <w:caps w:val="0"/>
-        </w:rPr>
-      </w:sdtEndPr>
-      <w:sdtContent>
+  <w:sdt>
+    <w:sdtPr>
+      <w:rPr>
+        <w:rStyle w:val="PageNumber"/>
+      </w:rPr>
+      <w:id w:val="801276493"/>
+      <w:docPartObj>
+        <w:docPartGallery w:val="Page Numbers (Top of Page)"/>
+        <w:docPartUnique/>
+      </w:docPartObj>
+    </w:sdtPr>
+    <w:sdtContent>
+      <w:p>
+        <w:pPr>
+          <w:pStyle w:val="Header"/>
+          <w:framePr w:wrap="none" w:vAnchor="text" w:hAnchor="margin" w:xAlign="right" w:y="1"/>
+          <w:rPr>
+            <w:rStyle w:val="PageNumber"/>
+          </w:rPr>
+        </w:pPr>
         <w:r>
           <w:rPr>
-            <w:rStyle w:val="Strong"/>
+            <w:rStyle w:val="PageNumber"/>
           </w:rPr>
-          <w:t>[Shortened Title up to 50 Characters]</w:t>
+          <w:fldChar w:fldCharType="begin"/>
         </w:r>
-      </w:sdtContent>
-    </w:sdt>
+        <w:r>
+          <w:rPr>
+            <w:rStyle w:val="PageNumber"/>
+          </w:rPr>
+          <w:instrText xml:space="preserve"> PAGE </w:instrText>
+        </w:r>
+        <w:r>
+          <w:rPr>
+            <w:rStyle w:val="PageNumber"/>
+          </w:rPr>
+          <w:fldChar w:fldCharType="separate"/>
+        </w:r>
+        <w:r>
+          <w:rPr>
+            <w:rStyle w:val="PageNumber"/>
+          </w:rPr>
+          <w:fldChar w:fldCharType="end"/>
+        </w:r>
+      </w:p>
+    </w:sdtContent>
+  </w:sdt>
+  <w:p>
+    <w:pPr>
+      <w:pStyle w:val="Header"/>
+      <w:ind w:right="360"/>
+    </w:pPr>
+  </w:p>
+</w:hdr>
+</file>
+
+<file path=word/header2.xml><?xml version="1.0" encoding="utf-8"?>
+<w:hdr xmlns:wpc="http://schemas.microsoft.com/office/word/2010/wordprocessingCanvas" xmlns:cx="http://schemas.microsoft.com/office/drawing/2014/chartex" xmlns:cx1="http://schemas.microsoft.com/office/drawing/2015/9/8/chartex" xmlns:cx2="http://schemas.microsoft.com/office/drawing/2015/10/21/chartex" xmlns:cx3="http://schemas.microsoft.com/office/drawing/2016/5/9/chartex" xmlns:cx4="http://schemas.microsoft.com/office/drawing/2016/5/10/chartex" xmlns:cx5="http://schemas.microsoft.com/office/drawing/2016/5/11/chartex" xmlns:cx6="http://schemas.microsoft.com/office/drawing/2016/5/12/chartex" xmlns:cx7="http://schemas.microsoft.com/office/drawing/2016/5/13/chartex" xmlns:cx8="http://schemas.microsoft.com/office/drawing/2016/5/14/chartex" xmlns:mc="http://schemas.openxmlformats.org/markup-compatibility/2006" xmlns:m="http://schemas.openxmlformats.org/officeDocument/2006/math" xmlns:aink="http://schemas.microsoft.com/office/drawing/2016/ink" xmlns:am3d="http://schemas.microsoft.com/office/drawing/2017/model3d" xmlns:oel="http://schemas.microsoft.com/office/2019/extlst" xmlns:r="http://schemas.openxmlformats.org/officeDocument/2006/relationships" xmlns:wp14="http://schemas.microsoft.com/office/word/2010/wordprocessingDrawing" xmlns:wp="http://schemas.openxmlformats.org/drawingml/2006/wordprocessingDrawing" xmlns:wpg="http://schemas.microsoft.com/office/word/2010/wordprocessingGroup" xmlns:wpi="http://schemas.microsoft.com/office/word/2010/wordprocessingInk" xmlns:wps="http://schemas.microsoft.com/office/word/2010/wordprocessingShape" xmlns:o="urn:schemas-microsoft-com:office:office" xmlns:v="urn:schemas-microsoft-com:vml" xmlns:w10="urn:schemas-microsoft-com:office:word" xmlns:w="http://schemas.openxmlformats.org/wordprocessingml/2006/main" xmlns:w14="http://schemas.microsoft.com/office/word/2010/wordml" xmlns:w15="http://schemas.microsoft.com/office/word/2012/wordml" xmlns:w16cei="http://schemas.microsoft.com/office/word/2026/wordml/cei" xmlns:w16cex="http://schemas.microsoft.com/office/word/2018/wordml/cex" xmlns:w16cid="http://schemas.microsoft.com/office/word/2016/wordml/cid" xmlns:w16="http://schemas.microsoft.com/office/word/2018/wordml" xmlns:w16sdtdh="http://schemas.microsoft.com/office/word/2020/wordml/sdtdatahash" xmlns:w16sdtfl="http://schemas.microsoft.com/office/word/2024/wordml/sdtformatlock" xmlns:w16se="http://schemas.microsoft.com/office/word/2015/wordml/symex" xmlns:w16du="http://schemas.microsoft.com/office/word/2023/wordml/word16du" xmlns:wne="http://schemas.microsoft.com/office/word/2006/wordml" mc:Ignorable="w14 w15 w16se w16cid w16 w16cex w16sdtdh w16sdtfl w16du wp14">
+  <w:sdt>
+    <w:sdtPr>
+      <w:rPr>
+        <w:rStyle w:val="PageNumber"/>
+      </w:rPr>
+      <w:id w:val="494922242"/>
+      <w:docPartObj>
+        <w:docPartGallery w:val="Page Numbers (Top of Page)"/>
+        <w:docPartUnique/>
+      </w:docPartObj>
+    </w:sdtPr>
+    <w:sdtContent>
+      <w:p>
+        <w:pPr>
+          <w:pStyle w:val="Header"/>
+          <w:framePr w:wrap="none" w:vAnchor="text" w:hAnchor="margin" w:xAlign="right" w:y="1"/>
+          <w:rPr>
+            <w:rStyle w:val="PageNumber"/>
+          </w:rPr>
+        </w:pPr>
+        <w:r>
+          <w:rPr>
+            <w:rStyle w:val="PageNumber"/>
+          </w:rPr>
+          <w:fldChar w:fldCharType="begin"/>
+        </w:r>
+        <w:r>
+          <w:rPr>
+            <w:rStyle w:val="PageNumber"/>
+          </w:rPr>
+          <w:instrText xml:space="preserve"> PAGE </w:instrText>
+        </w:r>
+        <w:r>
+          <w:rPr>
+            <w:rStyle w:val="PageNumber"/>
+          </w:rPr>
+          <w:fldChar w:fldCharType="separate"/>
+        </w:r>
+        <w:r>
+          <w:rPr>
+            <w:rStyle w:val="PageNumber"/>
+            <w:noProof/>
+          </w:rPr>
+          <w:t>3</w:t>
+        </w:r>
+        <w:r>
+          <w:rPr>
+            <w:rStyle w:val="PageNumber"/>
+          </w:rPr>
+          <w:fldChar w:fldCharType="end"/>
+        </w:r>
+      </w:p>
+    </w:sdtContent>
+  </w:sdt>
+  <w:p>
+    <w:pPr>
+      <w:pStyle w:val="Header"/>
+      <w:ind w:right="360"/>
+    </w:pPr>
     <w:r>
-      <w:rPr>
-        <w:rStyle w:val="Strong"/>
-      </w:rPr>
-      <w:t xml:space="preserve"> </w:t>
-    </w:r>
-    <w:r>
-      <w:rPr>
-        <w:rStyle w:val="Strong"/>
-      </w:rPr>
-      <w:ptab w:relativeTo="margin" w:alignment="right" w:leader="none"/>
-    </w:r>
-    <w:r>
-      <w:rPr>
-        <w:rStyle w:val="Strong"/>
-      </w:rPr>
-      <w:fldChar w:fldCharType="begin"/>
-    </w:r>
-    <w:r>
-      <w:rPr>
-        <w:rStyle w:val="Strong"/>
-      </w:rPr>
-      <w:instrText xml:space="preserve"> PAGE   \* MERGEFORMAT </w:instrText>
-    </w:r>
-    <w:r>
-      <w:rPr>
-        <w:rStyle w:val="Strong"/>
-      </w:rPr>
-      <w:fldChar w:fldCharType="separate"/>
-    </w:r>
-    <w:r>
-      <w:rPr>
-        <w:rStyle w:val="Strong"/>
-        <w:noProof/>
-      </w:rPr>
-      <w:t>9</w:t>
-    </w:r>
-    <w:r>
-      <w:rPr>
-        <w:rStyle w:val="Strong"/>
-        <w:noProof/>
-      </w:rPr>
-      <w:fldChar w:fldCharType="end"/>
+      <w:t>ADTA 4230 FINAL PROJECT REPORT</w:t>
     </w:r>
   </w:p>
 </w:hdr>
 </file>
 
-<file path=word/header2.xml><?xml version="1.0" encoding="utf-8"?>
+<file path=word/header3.xml><?xml version="1.0" encoding="utf-8"?>
 <w:hdr xmlns:wpc="http://schemas.microsoft.com/office/word/2010/wordprocessingCanvas" xmlns:cx="http://schemas.microsoft.com/office/drawing/2014/chartex" xmlns:cx1="http://schemas.microsoft.com/office/drawing/2015/9/8/chartex" xmlns:cx2="http://schemas.microsoft.com/office/drawing/2015/10/21/chartex" xmlns:cx3="http://schemas.microsoft.com/office/drawing/2016/5/9/chartex" xmlns:cx4="http://schemas.microsoft.com/office/drawing/2016/5/10/chartex" xmlns:cx5="http://schemas.microsoft.com/office/drawing/2016/5/11/chartex" xmlns:cx6="http://schemas.microsoft.com/office/drawing/2016/5/12/chartex" xmlns:cx7="http://schemas.microsoft.com/office/drawing/2016/5/13/chartex" xmlns:cx8="http://schemas.microsoft.com/office/drawing/2016/5/14/chartex" xmlns:mc="http://schemas.openxmlformats.org/markup-compatibility/2006" xmlns:m="http://schemas.openxmlformats.org/officeDocument/2006/math" xmlns:aink="http://schemas.microsoft.com/office/drawing/2016/ink" xmlns:am3d="http://schemas.microsoft.com/office/drawing/2017/model3d" xmlns:oel="http://schemas.microsoft.com/office/2019/extlst" xmlns:r="http://schemas.openxmlformats.org/officeDocument/2006/relationships" xmlns:wp14="http://schemas.microsoft.com/office/word/2010/wordprocessingDrawing" xmlns:wp="http://schemas.openxmlformats.org/drawingml/2006/wordprocessingDrawing" xmlns:wpg="http://schemas.microsoft.com/office/word/2010/wordprocessingGroup" xmlns:wpi="http://schemas.microsoft.com/office/word/2010/wordprocessingInk" xmlns:wps="http://schemas.microsoft.com/office/word/2010/wordprocessingShape" xmlns:o="urn:schemas-microsoft-com:office:office" xmlns:v="urn:schemas-microsoft-com:vml" xmlns:w10="urn:schemas-microsoft-com:office:word" xmlns:w="http://schemas.openxmlformats.org/wordprocessingml/2006/main" xmlns:w14="http://schemas.microsoft.com/office/word/2010/wordml" xmlns:w15="http://schemas.microsoft.com/office/word/2012/wordml" xmlns:w16cei="http://schemas.microsoft.com/office/word/2026/wordml/cei" xmlns:w16cex="http://schemas.microsoft.com/office/word/2018/wordml/cex" xmlns:w16cid="http://schemas.microsoft.com/office/word/2016/wordml/cid" xmlns:w16="http://schemas.microsoft.com/office/word/2018/wordml" xmlns:w16sdtdh="http://schemas.microsoft.com/office/word/2020/wordml/sdtdatahash" xmlns:w16sdtfl="http://schemas.microsoft.com/office/word/2024/wordml/sdtformatlock" xmlns:w16se="http://schemas.microsoft.com/office/word/2015/wordml/symex" xmlns:w16du="http://schemas.microsoft.com/office/word/2023/wordml/word16du" xmlns:wne="http://schemas.microsoft.com/office/word/2006/wordml" mc:Ignorable="w14 w15 w16se w16cid w16 w16cex w16sdtdh w16sdtfl w16du wp14">
   <w:p>
     <w:pPr>
@@ -6429,6 +5212,14 @@
       <w:lang w:eastAsia="en-US"/>
     </w:rPr>
   </w:style>
+  <w:style w:type="character" w:styleId="PageNumber">
+    <w:name w:val="page number"/>
+    <w:basedOn w:val="DefaultParagraphFont"/>
+    <w:uiPriority w:val="99"/>
+    <w:semiHidden/>
+    <w:unhideWhenUsed/>
+    <w:rsid w:val="007C01B8"/>
+  </w:style>
 </w:styles>
 </file>
 
@@ -6483,229 +5274,6 @@
           </w:pPr>
           <w:r>
             <w:t>[Title Here, up to 12 Words, on One to Two Lines]</w:t>
-          </w:r>
-        </w:p>
-      </w:docPartBody>
-    </w:docPart>
-    <w:docPart>
-      <w:docPartPr>
-        <w:name w:val="9B569ECFE4672044BE3BF43B408B78D3"/>
-        <w:category>
-          <w:name w:val="General"/>
-          <w:gallery w:val="placeholder"/>
-        </w:category>
-        <w:types>
-          <w:type w:val="bbPlcHdr"/>
-        </w:types>
-        <w:behaviors>
-          <w:behavior w:val="content"/>
-        </w:behaviors>
-        <w:guid w:val="{BAF77A37-FD53-2D48-B944-9C0965745ED2}"/>
-      </w:docPartPr>
-      <w:docPartBody>
-        <w:p>
-          <w:pPr>
-            <w:pStyle w:val="9B569ECFE4672044BE3BF43B408B78D3"/>
-          </w:pPr>
-          <w:r>
-            <w:rPr>
-              <w:rStyle w:val="Heading3Char"/>
-            </w:rPr>
-            <w:t>[Heading 3]</w:t>
-          </w:r>
-        </w:p>
-      </w:docPartBody>
-    </w:docPart>
-    <w:docPart>
-      <w:docPartPr>
-        <w:name w:val="2CEEC421EB3E8F49B717BAC366B4492A"/>
-        <w:category>
-          <w:name w:val="General"/>
-          <w:gallery w:val="placeholder"/>
-        </w:category>
-        <w:types>
-          <w:type w:val="bbPlcHdr"/>
-        </w:types>
-        <w:behaviors>
-          <w:behavior w:val="content"/>
-        </w:behaviors>
-        <w:guid w:val="{645FCCBE-02B5-DF44-B3A1-202DFEEA0164}"/>
-      </w:docPartPr>
-      <w:docPartBody>
-        <w:p>
-          <w:pPr>
-            <w:pStyle w:val="2CEEC421EB3E8F49B717BAC366B4492A"/>
-          </w:pPr>
-          <w:r>
-            <w:t>[Include a period at the end of a run-in heading.  Note that you can include consecutive paragraphs with their own headings, where appropriate.]</w:t>
-          </w:r>
-        </w:p>
-      </w:docPartBody>
-    </w:docPart>
-    <w:docPart>
-      <w:docPartPr>
-        <w:name w:val="35A156D791984A47BE25D2FEB70E97E8"/>
-        <w:category>
-          <w:name w:val="General"/>
-          <w:gallery w:val="placeholder"/>
-        </w:category>
-        <w:types>
-          <w:type w:val="bbPlcHdr"/>
-        </w:types>
-        <w:behaviors>
-          <w:behavior w:val="content"/>
-        </w:behaviors>
-        <w:guid w:val="{B6E86CA2-0F97-C145-A18B-6C553E3F933B}"/>
-      </w:docPartPr>
-      <w:docPartBody>
-        <w:p>
-          <w:pPr>
-            <w:pStyle w:val="35A156D791984A47BE25D2FEB70E97E8"/>
-          </w:pPr>
-          <w:r>
-            <w:rPr>
-              <w:rStyle w:val="Heading4Char"/>
-            </w:rPr>
-            <w:t>[Heading 4]</w:t>
-          </w:r>
-        </w:p>
-      </w:docPartBody>
-    </w:docPart>
-    <w:docPart>
-      <w:docPartPr>
-        <w:name w:val="554653C5B5B9B04EBE5B525E81659628"/>
-        <w:category>
-          <w:name w:val="General"/>
-          <w:gallery w:val="placeholder"/>
-        </w:category>
-        <w:types>
-          <w:type w:val="bbPlcHdr"/>
-        </w:types>
-        <w:behaviors>
-          <w:behavior w:val="content"/>
-        </w:behaviors>
-        <w:guid w:val="{A655C47E-6E36-624E-9D88-E0784AB37792}"/>
-      </w:docPartPr>
-      <w:docPartBody>
-        <w:p>
-          <w:pPr>
-            <w:pStyle w:val="554653C5B5B9B04EBE5B525E81659628"/>
-          </w:pPr>
-          <w:r>
-            <w:t>[When using headings, don’t skip levels.  If you need a heading 3, 4, or 5 with no text following it before the next heading, just add a period at the end of the heading and then start a new paragraph for the subheading and its text.]</w:t>
-          </w:r>
-        </w:p>
-      </w:docPartBody>
-    </w:docPart>
-    <w:docPart>
-      <w:docPartPr>
-        <w:name w:val="7B56FEC57023824F8223A72F9C1D962C"/>
-        <w:category>
-          <w:name w:val="General"/>
-          <w:gallery w:val="placeholder"/>
-        </w:category>
-        <w:types>
-          <w:type w:val="bbPlcHdr"/>
-        </w:types>
-        <w:behaviors>
-          <w:behavior w:val="content"/>
-        </w:behaviors>
-        <w:guid w:val="{14F9522B-DD43-1F47-878A-A2956E7CAF47}"/>
-      </w:docPartPr>
-      <w:docPartBody>
-        <w:p>
-          <w:pPr>
-            <w:pStyle w:val="7B56FEC57023824F8223A72F9C1D962C"/>
-          </w:pPr>
-          <w:r>
-            <w:rPr>
-              <w:noProof/>
-            </w:rPr>
-            <w:t>(Last Name, Year)</w:t>
-          </w:r>
-        </w:p>
-      </w:docPartBody>
-    </w:docPart>
-    <w:docPart>
-      <w:docPartPr>
-        <w:name w:val="A9B80FFE705488468CB3A6035A940C55"/>
-        <w:category>
-          <w:name w:val="General"/>
-          <w:gallery w:val="placeholder"/>
-        </w:category>
-        <w:types>
-          <w:type w:val="bbPlcHdr"/>
-        </w:types>
-        <w:behaviors>
-          <w:behavior w:val="content"/>
-        </w:behaviors>
-        <w:guid w:val="{BBF0C4D9-0482-CE44-A169-CD2B4B18127D}"/>
-      </w:docPartPr>
-      <w:docPartBody>
-        <w:p>
-          <w:pPr>
-            <w:pStyle w:val="A9B80FFE705488468CB3A6035A940C55"/>
-          </w:pPr>
-          <w:r>
-            <w:rPr>
-              <w:rStyle w:val="Heading5Char"/>
-            </w:rPr>
-            <w:t>[Heading 5]</w:t>
-          </w:r>
-        </w:p>
-      </w:docPartBody>
-    </w:docPart>
-    <w:docPart>
-      <w:docPartPr>
-        <w:name w:val="C96ADC24F88B144FAE13AADE8A145973"/>
-        <w:category>
-          <w:name w:val="General"/>
-          <w:gallery w:val="placeholder"/>
-        </w:category>
-        <w:types>
-          <w:type w:val="bbPlcHdr"/>
-        </w:types>
-        <w:behaviors>
-          <w:behavior w:val="content"/>
-        </w:behaviors>
-        <w:guid w:val="{981C2267-A5EB-5746-ACF8-393BCCA5E480}"/>
-      </w:docPartPr>
-      <w:docPartBody>
-        <w:p>
-          <w:pPr>
-            <w:pStyle w:val="C96ADC24F88B144FAE13AADE8A145973"/>
-          </w:pPr>
-          <w:r>
-            <w:t>[Like all sections of your paper, references start on their own page, as shown on the page that follows.  The body of the References section uses the Bibliography style.  For more detailed information on formatting references, see the APA Style Manual, 6th Edition.</w:t>
-          </w:r>
-        </w:p>
-      </w:docPartBody>
-    </w:docPart>
-    <w:docPart>
-      <w:docPartPr>
-        <w:name w:val="9CA9D4979D2E3D4A869F47F97AB32CC8"/>
-        <w:category>
-          <w:name w:val="General"/>
-          <w:gallery w:val="placeholder"/>
-        </w:category>
-        <w:types>
-          <w:type w:val="bbPlcHdr"/>
-        </w:types>
-        <w:behaviors>
-          <w:behavior w:val="content"/>
-        </w:behaviors>
-        <w:guid w:val="{ECD1B0BF-B549-A94A-95E0-8AB7DF5FADFE}"/>
-      </w:docPartPr>
-      <w:docPartBody>
-        <w:p>
-          <w:pPr>
-            <w:pStyle w:val="9CA9D4979D2E3D4A869F47F97AB32CC8"/>
-          </w:pPr>
-          <w:r>
-            <w:rPr>
-              <w:noProof/>
-            </w:rPr>
-            <w:t>(Last Name, Year)</w:t>
           </w:r>
         </w:p>
       </w:docPartBody>
@@ -6777,122 +5345,6 @@
               <w:noProof/>
             </w:rPr>
             <w:t>City Name: Publisher Name.</w:t>
-          </w:r>
-        </w:p>
-      </w:docPartBody>
-    </w:docPart>
-    <w:docPart>
-      <w:docPartPr>
-        <w:name w:val="D9894D6E0CB39148A644FA0F37967BB9"/>
-        <w:category>
-          <w:name w:val="General"/>
-          <w:gallery w:val="placeholder"/>
-        </w:category>
-        <w:types>
-          <w:type w:val="bbPlcHdr"/>
-        </w:types>
-        <w:behaviors>
-          <w:behavior w:val="content"/>
-        </w:behaviors>
-        <w:guid w:val="{042EEF1E-DF40-8741-B3BA-D1D868F782A6}"/>
-      </w:docPartPr>
-      <w:docPartBody>
-        <w:p>
-          <w:pPr>
-            <w:pStyle w:val="D9894D6E0CB39148A644FA0F37967BB9"/>
-          </w:pPr>
-          <w:r>
-            <w:t xml:space="preserve">[Add footnotes, if any, on their own page following references.  For APA formatting requirements, it’s easy to just type your own footnote references and notes.  To format a footnote reference, select the number and then apply the Footnote Reference.  The body of a footnote, such as this example, uses the Normal text style.  </w:t>
-          </w:r>
-          <w:r>
-            <w:rPr>
-              <w:rStyle w:val="Emphasis"/>
-            </w:rPr>
-            <w:t>(Note:  If you delete this sample footnote, don’t forget to delete its in-text reference as well.)</w:t>
-          </w:r>
-          <w:r>
-            <w:t>]</w:t>
-          </w:r>
-        </w:p>
-      </w:docPartBody>
-    </w:docPart>
-    <w:docPart>
-      <w:docPartPr>
-        <w:name w:val="F15817FC0AD49D4E93CE56ED735161D3"/>
-        <w:category>
-          <w:name w:val="General"/>
-          <w:gallery w:val="placeholder"/>
-        </w:category>
-        <w:types>
-          <w:type w:val="bbPlcHdr"/>
-        </w:types>
-        <w:behaviors>
-          <w:behavior w:val="content"/>
-        </w:behaviors>
-        <w:guid w:val="{B95A0E21-A29C-694C-846A-E603954BF95D}"/>
-      </w:docPartPr>
-      <w:docPartBody>
-        <w:p>
-          <w:pPr>
-            <w:pStyle w:val="F15817FC0AD49D4E93CE56ED735161D3"/>
-          </w:pPr>
-          <w:r>
-            <w:rPr>
-              <w:rStyle w:val="Emphasis"/>
-            </w:rPr>
-            <w:t>[Table Title]</w:t>
-          </w:r>
-        </w:p>
-      </w:docPartBody>
-    </w:docPart>
-    <w:docPart>
-      <w:docPartPr>
-        <w:name w:val="6DC6EECFD59EFE4DB586016C1C9CDE89"/>
-        <w:category>
-          <w:name w:val="General"/>
-          <w:gallery w:val="placeholder"/>
-        </w:category>
-        <w:types>
-          <w:type w:val="bbPlcHdr"/>
-        </w:types>
-        <w:behaviors>
-          <w:behavior w:val="content"/>
-        </w:behaviors>
-        <w:guid w:val="{482456BF-3E78-E247-80E6-E99E7F36D2EB}"/>
-      </w:docPartPr>
-      <w:docPartBody>
-        <w:p>
-          <w:pPr>
-            <w:pStyle w:val="6DC6EECFD59EFE4DB586016C1C9CDE89"/>
-          </w:pPr>
-          <w:r>
-            <w:t>[Place all tables for your paper in a tables section, following references (and, if applicable, footnotes).  Start a new page for each table, include a table number and table title for each, as shown on this page.  All explanatory text appears in a table note that follows the table, such as this one.  Use the Table/Figure style to get the spacing between table and note.  Tables in APA format can use single or 1.5 line spacing.  Include a heading for every row and column, even if the content seems obvious.  To insert a table, on the Insert tab, tap Table.  New tables that you create in this document use APA format by default.]</w:t>
-          </w:r>
-        </w:p>
-      </w:docPartBody>
-    </w:docPart>
-    <w:docPart>
-      <w:docPartPr>
-        <w:name w:val="07E172FFE7C59D46AC065BEE4DA0BD59"/>
-        <w:category>
-          <w:name w:val="General"/>
-          <w:gallery w:val="placeholder"/>
-        </w:category>
-        <w:types>
-          <w:type w:val="bbPlcHdr"/>
-        </w:types>
-        <w:behaviors>
-          <w:behavior w:val="content"/>
-        </w:behaviors>
-        <w:guid w:val="{6CC4CECA-A93B-A94D-B39B-FF9945D2C149}"/>
-      </w:docPartPr>
-      <w:docPartBody>
-        <w:p>
-          <w:pPr>
-            <w:pStyle w:val="07E172FFE7C59D46AC065BEE4DA0BD59"/>
-          </w:pPr>
-          <w:r>
-            <w:t>[Include all figures in their own section, following references (and footnotes and tables, if applicable).  Include a numbered caption for each figure.  Use the Table/Figure style for easy spacing between figure and caption.]</w:t>
           </w:r>
         </w:p>
       </w:docPartBody>

</xml_diff>

<commit_message>
feat: add data preparation
</commit_message>
<xml_diff>
--- a/ADTA 4230 Final Project Report.docx
+++ b/ADTA 4230 Final Project Report.docx
@@ -20,7 +20,7 @@
         </w:sdtPr>
         <w:sdtContent>
           <w:r>
-            <w:t>ADTA 4230 Final Project Report – An Analysis on Covid Testing</w:t>
+            <w:t>An Analysis on Covid Testing</w:t>
           </w:r>
         </w:sdtContent>
       </w:sdt>
@@ -99,13 +99,13 @@
           <w:r>
             <w:fldChar w:fldCharType="separate"/>
           </w:r>
-          <w:hyperlink w:anchor="_Toc235626546" w:history="1">
+          <w:hyperlink w:anchor="_Toc235630413" w:history="1">
             <w:r>
               <w:rPr>
                 <w:rStyle w:val="Hyperlink"/>
                 <w:noProof/>
               </w:rPr>
-              <w:t>ADTA 4230 Final Project Report – An Analysis on Covid Testing</w:t>
+              <w:t>An Analysis on Covid Testing</w:t>
             </w:r>
             <w:r>
               <w:rPr>
@@ -126,7 +126,7 @@
                 <w:noProof/>
                 <w:webHidden/>
               </w:rPr>
-              <w:instrText xml:space="preserve"> PAGEREF _Toc235626546 \h </w:instrText>
+              <w:instrText xml:space="preserve"> PAGEREF _Toc235630413 \h </w:instrText>
             </w:r>
             <w:r>
               <w:rPr>
@@ -146,7 +146,149 @@
                 <w:noProof/>
                 <w:webHidden/>
               </w:rPr>
-              <w:t>3</w:t>
+              <w:t>4</w:t>
+            </w:r>
+            <w:r>
+              <w:rPr>
+                <w:noProof/>
+                <w:webHidden/>
+              </w:rPr>
+              <w:fldChar w:fldCharType="end"/>
+            </w:r>
+          </w:hyperlink>
+        </w:p>
+        <w:p>
+          <w:pPr>
+            <w:pStyle w:val="TOC2"/>
+            <w:tabs>
+              <w:tab w:val="right" w:leader="dot" w:pos="9350"/>
+            </w:tabs>
+            <w:rPr>
+              <w:noProof/>
+              <w:kern w:val="2"/>
+              <w:lang w:eastAsia="en-US"/>
+              <w14:ligatures w14:val="standardContextual"/>
+            </w:rPr>
+          </w:pPr>
+          <w:hyperlink w:anchor="_Toc235630414" w:history="1">
+            <w:r>
+              <w:rPr>
+                <w:rStyle w:val="Hyperlink"/>
+                <w:noProof/>
+              </w:rPr>
+              <w:t>Business Understanding</w:t>
+            </w:r>
+            <w:r>
+              <w:rPr>
+                <w:noProof/>
+                <w:webHidden/>
+              </w:rPr>
+              <w:tab/>
+            </w:r>
+            <w:r>
+              <w:rPr>
+                <w:noProof/>
+                <w:webHidden/>
+              </w:rPr>
+              <w:fldChar w:fldCharType="begin"/>
+            </w:r>
+            <w:r>
+              <w:rPr>
+                <w:noProof/>
+                <w:webHidden/>
+              </w:rPr>
+              <w:instrText xml:space="preserve"> PAGEREF _Toc235630414 \h </w:instrText>
+            </w:r>
+            <w:r>
+              <w:rPr>
+                <w:noProof/>
+                <w:webHidden/>
+              </w:rPr>
+            </w:r>
+            <w:r>
+              <w:rPr>
+                <w:noProof/>
+                <w:webHidden/>
+              </w:rPr>
+              <w:fldChar w:fldCharType="separate"/>
+            </w:r>
+            <w:r>
+              <w:rPr>
+                <w:noProof/>
+                <w:webHidden/>
+              </w:rPr>
+              <w:t>4</w:t>
+            </w:r>
+            <w:r>
+              <w:rPr>
+                <w:noProof/>
+                <w:webHidden/>
+              </w:rPr>
+              <w:fldChar w:fldCharType="end"/>
+            </w:r>
+          </w:hyperlink>
+        </w:p>
+        <w:p>
+          <w:pPr>
+            <w:pStyle w:val="TOC2"/>
+            <w:tabs>
+              <w:tab w:val="right" w:leader="dot" w:pos="9350"/>
+            </w:tabs>
+            <w:rPr>
+              <w:noProof/>
+              <w:kern w:val="2"/>
+              <w:lang w:eastAsia="en-US"/>
+              <w14:ligatures w14:val="standardContextual"/>
+            </w:rPr>
+          </w:pPr>
+          <w:hyperlink w:anchor="_Toc235630415" w:history="1">
+            <w:r>
+              <w:rPr>
+                <w:rStyle w:val="Hyperlink"/>
+                <w:noProof/>
+              </w:rPr>
+              <w:t>Analytics questions</w:t>
+            </w:r>
+            <w:r>
+              <w:rPr>
+                <w:noProof/>
+                <w:webHidden/>
+              </w:rPr>
+              <w:tab/>
+            </w:r>
+            <w:r>
+              <w:rPr>
+                <w:noProof/>
+                <w:webHidden/>
+              </w:rPr>
+              <w:fldChar w:fldCharType="begin"/>
+            </w:r>
+            <w:r>
+              <w:rPr>
+                <w:noProof/>
+                <w:webHidden/>
+              </w:rPr>
+              <w:instrText xml:space="preserve"> PAGEREF _Toc235630415 \h </w:instrText>
+            </w:r>
+            <w:r>
+              <w:rPr>
+                <w:noProof/>
+                <w:webHidden/>
+              </w:rPr>
+            </w:r>
+            <w:r>
+              <w:rPr>
+                <w:noProof/>
+                <w:webHidden/>
+              </w:rPr>
+              <w:fldChar w:fldCharType="separate"/>
+            </w:r>
+            <w:r>
+              <w:rPr>
+                <w:noProof/>
+                <w:webHidden/>
+              </w:rPr>
+              <w:t>4</w:t>
             </w:r>
             <w:r>
               <w:rPr>
@@ -170,7 +312,7 @@
               <w14:ligatures w14:val="standardContextual"/>
             </w:rPr>
           </w:pPr>
-          <w:hyperlink w:anchor="_Toc235626547" w:history="1">
+          <w:hyperlink w:anchor="_Toc235630416" w:history="1">
             <w:r>
               <w:rPr>
                 <w:rStyle w:val="Hyperlink"/>
@@ -197,7 +339,7 @@
                 <w:noProof/>
                 <w:webHidden/>
               </w:rPr>
-              <w:instrText xml:space="preserve"> PAGEREF _Toc235626547 \h </w:instrText>
+              <w:instrText xml:space="preserve"> PAGEREF _Toc235630416 \h </w:instrText>
             </w:r>
             <w:r>
               <w:rPr>
@@ -217,7 +359,7 @@
                 <w:noProof/>
                 <w:webHidden/>
               </w:rPr>
-              <w:t>4</w:t>
+              <w:t>5</w:t>
             </w:r>
             <w:r>
               <w:rPr>
@@ -241,7 +383,7 @@
               <w14:ligatures w14:val="standardContextual"/>
             </w:rPr>
           </w:pPr>
-          <w:hyperlink w:anchor="_Toc235626548" w:history="1">
+          <w:hyperlink w:anchor="_Toc235630417" w:history="1">
             <w:r>
               <w:rPr>
                 <w:rStyle w:val="Hyperlink"/>
@@ -268,7 +410,7 @@
                 <w:noProof/>
                 <w:webHidden/>
               </w:rPr>
-              <w:instrText xml:space="preserve"> PAGEREF _Toc235626548 \h </w:instrText>
+              <w:instrText xml:space="preserve"> PAGEREF _Toc235630417 \h </w:instrText>
             </w:r>
             <w:r>
               <w:rPr>
@@ -288,7 +430,7 @@
                 <w:noProof/>
                 <w:webHidden/>
               </w:rPr>
-              <w:t>4</w:t>
+              <w:t>5</w:t>
             </w:r>
             <w:r>
               <w:rPr>
@@ -312,7 +454,7 @@
               <w14:ligatures w14:val="standardContextual"/>
             </w:rPr>
           </w:pPr>
-          <w:hyperlink w:anchor="_Toc235626549" w:history="1">
+          <w:hyperlink w:anchor="_Toc235630418" w:history="1">
             <w:r>
               <w:rPr>
                 <w:rStyle w:val="Hyperlink"/>
@@ -339,7 +481,7 @@
                 <w:noProof/>
                 <w:webHidden/>
               </w:rPr>
-              <w:instrText xml:space="preserve"> PAGEREF _Toc235626549 \h </w:instrText>
+              <w:instrText xml:space="preserve"> PAGEREF _Toc235630418 \h </w:instrText>
             </w:r>
             <w:r>
               <w:rPr>
@@ -359,7 +501,7 @@
                 <w:noProof/>
                 <w:webHidden/>
               </w:rPr>
-              <w:t>4</w:t>
+              <w:t>6</w:t>
             </w:r>
             <w:r>
               <w:rPr>
@@ -383,7 +525,7 @@
               <w14:ligatures w14:val="standardContextual"/>
             </w:rPr>
           </w:pPr>
-          <w:hyperlink w:anchor="_Toc235626550" w:history="1">
+          <w:hyperlink w:anchor="_Toc235630419" w:history="1">
             <w:r>
               <w:rPr>
                 <w:rStyle w:val="Hyperlink"/>
@@ -411,7 +553,7 @@
                 <w:noProof/>
                 <w:webHidden/>
               </w:rPr>
-              <w:instrText xml:space="preserve"> PAGEREF _Toc235626550 \h </w:instrText>
+              <w:instrText xml:space="preserve"> PAGEREF _Toc235630419 \h </w:instrText>
             </w:r>
             <w:r>
               <w:rPr>
@@ -431,7 +573,7 @@
                 <w:noProof/>
                 <w:webHidden/>
               </w:rPr>
-              <w:t>5</w:t>
+              <w:t>6</w:t>
             </w:r>
             <w:r>
               <w:rPr>
@@ -455,7 +597,7 @@
               <w14:ligatures w14:val="standardContextual"/>
             </w:rPr>
           </w:pPr>
-          <w:hyperlink w:anchor="_Toc235626551" w:history="1">
+          <w:hyperlink w:anchor="_Toc235630420" w:history="1">
             <w:r>
               <w:rPr>
                 <w:rStyle w:val="Hyperlink"/>
@@ -483,7 +625,7 @@
                 <w:noProof/>
                 <w:webHidden/>
               </w:rPr>
-              <w:instrText xml:space="preserve"> PAGEREF _Toc235626551 \h </w:instrText>
+              <w:instrText xml:space="preserve"> PAGEREF _Toc235630420 \h </w:instrText>
             </w:r>
             <w:r>
               <w:rPr>
@@ -503,7 +645,7 @@
                 <w:noProof/>
                 <w:webHidden/>
               </w:rPr>
-              <w:t>6</w:t>
+              <w:t>7</w:t>
             </w:r>
             <w:r>
               <w:rPr>
@@ -527,7 +669,7 @@
               <w14:ligatures w14:val="standardContextual"/>
             </w:rPr>
           </w:pPr>
-          <w:hyperlink w:anchor="_Toc235626552" w:history="1">
+          <w:hyperlink w:anchor="_Toc235630421" w:history="1">
             <w:r>
               <w:rPr>
                 <w:rStyle w:val="Hyperlink"/>
@@ -555,7 +697,7 @@
                 <w:noProof/>
                 <w:webHidden/>
               </w:rPr>
-              <w:instrText xml:space="preserve"> PAGEREF _Toc235626552 \h </w:instrText>
+              <w:instrText xml:space="preserve"> PAGEREF _Toc235630421 \h </w:instrText>
             </w:r>
             <w:r>
               <w:rPr>
@@ -575,7 +717,7 @@
                 <w:noProof/>
                 <w:webHidden/>
               </w:rPr>
-              <w:t>7</w:t>
+              <w:t>8</w:t>
             </w:r>
             <w:r>
               <w:rPr>
@@ -599,7 +741,7 @@
               <w14:ligatures w14:val="standardContextual"/>
             </w:rPr>
           </w:pPr>
-          <w:hyperlink w:anchor="_Toc235626553" w:history="1">
+          <w:hyperlink w:anchor="_Toc235630422" w:history="1">
             <w:r>
               <w:rPr>
                 <w:rStyle w:val="Hyperlink"/>
@@ -627,7 +769,7 @@
                 <w:noProof/>
                 <w:webHidden/>
               </w:rPr>
-              <w:instrText xml:space="preserve"> PAGEREF _Toc235626553 \h </w:instrText>
+              <w:instrText xml:space="preserve"> PAGEREF _Toc235630422 \h </w:instrText>
             </w:r>
             <w:r>
               <w:rPr>
@@ -647,7 +789,7 @@
                 <w:noProof/>
                 <w:webHidden/>
               </w:rPr>
-              <w:t>7</w:t>
+              <w:t>8</w:t>
             </w:r>
             <w:r>
               <w:rPr>
@@ -671,7 +813,7 @@
               <w14:ligatures w14:val="standardContextual"/>
             </w:rPr>
           </w:pPr>
-          <w:hyperlink w:anchor="_Toc235626554" w:history="1">
+          <w:hyperlink w:anchor="_Toc235630423" w:history="1">
             <w:r>
               <w:rPr>
                 <w:rStyle w:val="Hyperlink"/>
@@ -699,7 +841,7 @@
                 <w:noProof/>
                 <w:webHidden/>
               </w:rPr>
-              <w:instrText xml:space="preserve"> PAGEREF _Toc235626554 \h </w:instrText>
+              <w:instrText xml:space="preserve"> PAGEREF _Toc235630423 \h </w:instrText>
             </w:r>
             <w:r>
               <w:rPr>
@@ -719,7 +861,7 @@
                 <w:noProof/>
                 <w:webHidden/>
               </w:rPr>
-              <w:t>8</w:t>
+              <w:t>9</w:t>
             </w:r>
             <w:r>
               <w:rPr>
@@ -743,7 +885,7 @@
               <w14:ligatures w14:val="standardContextual"/>
             </w:rPr>
           </w:pPr>
-          <w:hyperlink w:anchor="_Toc235626555" w:history="1">
+          <w:hyperlink w:anchor="_Toc235630424" w:history="1">
             <w:r>
               <w:rPr>
                 <w:rStyle w:val="Hyperlink"/>
@@ -771,7 +913,7 @@
                 <w:noProof/>
                 <w:webHidden/>
               </w:rPr>
-              <w:instrText xml:space="preserve"> PAGEREF _Toc235626555 \h </w:instrText>
+              <w:instrText xml:space="preserve"> PAGEREF _Toc235630424 \h </w:instrText>
             </w:r>
             <w:r>
               <w:rPr>
@@ -791,7 +933,7 @@
                 <w:noProof/>
                 <w:webHidden/>
               </w:rPr>
-              <w:t>9</w:t>
+              <w:t>10</w:t>
             </w:r>
             <w:r>
               <w:rPr>
@@ -815,7 +957,7 @@
               <w14:ligatures w14:val="standardContextual"/>
             </w:rPr>
           </w:pPr>
-          <w:hyperlink w:anchor="_Toc235626556" w:history="1">
+          <w:hyperlink w:anchor="_Toc235630425" w:history="1">
             <w:r>
               <w:rPr>
                 <w:rStyle w:val="Hyperlink"/>
@@ -843,7 +985,7 @@
                 <w:noProof/>
                 <w:webHidden/>
               </w:rPr>
-              <w:instrText xml:space="preserve"> PAGEREF _Toc235626556 \h </w:instrText>
+              <w:instrText xml:space="preserve"> PAGEREF _Toc235630425 \h </w:instrText>
             </w:r>
             <w:r>
               <w:rPr>
@@ -863,7 +1005,7 @@
                 <w:noProof/>
                 <w:webHidden/>
               </w:rPr>
-              <w:t>10</w:t>
+              <w:t>11</w:t>
             </w:r>
             <w:r>
               <w:rPr>
@@ -887,7 +1029,7 @@
               <w14:ligatures w14:val="standardContextual"/>
             </w:rPr>
           </w:pPr>
-          <w:hyperlink w:anchor="_Toc235626557" w:history="1">
+          <w:hyperlink w:anchor="_Toc235630426" w:history="1">
             <w:r>
               <w:rPr>
                 <w:rStyle w:val="Hyperlink"/>
@@ -915,7 +1057,7 @@
                 <w:noProof/>
                 <w:webHidden/>
               </w:rPr>
-              <w:instrText xml:space="preserve"> PAGEREF _Toc235626557 \h </w:instrText>
+              <w:instrText xml:space="preserve"> PAGEREF _Toc235630426 \h </w:instrText>
             </w:r>
             <w:r>
               <w:rPr>
@@ -936,6 +1078,221 @@
                 <w:webHidden/>
               </w:rPr>
               <w:t>11</w:t>
+            </w:r>
+            <w:r>
+              <w:rPr>
+                <w:noProof/>
+                <w:webHidden/>
+              </w:rPr>
+              <w:fldChar w:fldCharType="end"/>
+            </w:r>
+          </w:hyperlink>
+        </w:p>
+        <w:p>
+          <w:pPr>
+            <w:pStyle w:val="TOC2"/>
+            <w:tabs>
+              <w:tab w:val="right" w:leader="dot" w:pos="9350"/>
+            </w:tabs>
+            <w:rPr>
+              <w:noProof/>
+              <w:kern w:val="2"/>
+              <w:lang w:eastAsia="en-US"/>
+              <w14:ligatures w14:val="standardContextual"/>
+            </w:rPr>
+          </w:pPr>
+          <w:hyperlink w:anchor="_Toc235630427" w:history="1">
+            <w:r>
+              <w:rPr>
+                <w:rStyle w:val="Hyperlink"/>
+                <w:noProof/>
+                <w:lang w:eastAsia="en-US"/>
+              </w:rPr>
+              <w:t>Missing Data Handling</w:t>
+            </w:r>
+            <w:r>
+              <w:rPr>
+                <w:noProof/>
+                <w:webHidden/>
+              </w:rPr>
+              <w:tab/>
+            </w:r>
+            <w:r>
+              <w:rPr>
+                <w:noProof/>
+                <w:webHidden/>
+              </w:rPr>
+              <w:fldChar w:fldCharType="begin"/>
+            </w:r>
+            <w:r>
+              <w:rPr>
+                <w:noProof/>
+                <w:webHidden/>
+              </w:rPr>
+              <w:instrText xml:space="preserve"> PAGEREF _Toc235630427 \h </w:instrText>
+            </w:r>
+            <w:r>
+              <w:rPr>
+                <w:noProof/>
+                <w:webHidden/>
+              </w:rPr>
+            </w:r>
+            <w:r>
+              <w:rPr>
+                <w:noProof/>
+                <w:webHidden/>
+              </w:rPr>
+              <w:fldChar w:fldCharType="separate"/>
+            </w:r>
+            <w:r>
+              <w:rPr>
+                <w:noProof/>
+                <w:webHidden/>
+              </w:rPr>
+              <w:t>11</w:t>
+            </w:r>
+            <w:r>
+              <w:rPr>
+                <w:noProof/>
+                <w:webHidden/>
+              </w:rPr>
+              <w:fldChar w:fldCharType="end"/>
+            </w:r>
+          </w:hyperlink>
+        </w:p>
+        <w:p>
+          <w:pPr>
+            <w:pStyle w:val="TOC2"/>
+            <w:tabs>
+              <w:tab w:val="right" w:leader="dot" w:pos="9350"/>
+            </w:tabs>
+            <w:rPr>
+              <w:noProof/>
+              <w:kern w:val="2"/>
+              <w:lang w:eastAsia="en-US"/>
+              <w14:ligatures w14:val="standardContextual"/>
+            </w:rPr>
+          </w:pPr>
+          <w:hyperlink w:anchor="_Toc235630428" w:history="1">
+            <w:r>
+              <w:rPr>
+                <w:rStyle w:val="Hyperlink"/>
+                <w:noProof/>
+                <w:lang w:eastAsia="en-US"/>
+              </w:rPr>
+              <w:t>Variable Encoding</w:t>
+            </w:r>
+            <w:r>
+              <w:rPr>
+                <w:noProof/>
+                <w:webHidden/>
+              </w:rPr>
+              <w:tab/>
+            </w:r>
+            <w:r>
+              <w:rPr>
+                <w:noProof/>
+                <w:webHidden/>
+              </w:rPr>
+              <w:fldChar w:fldCharType="begin"/>
+            </w:r>
+            <w:r>
+              <w:rPr>
+                <w:noProof/>
+                <w:webHidden/>
+              </w:rPr>
+              <w:instrText xml:space="preserve"> PAGEREF _Toc235630428 \h </w:instrText>
+            </w:r>
+            <w:r>
+              <w:rPr>
+                <w:noProof/>
+                <w:webHidden/>
+              </w:rPr>
+            </w:r>
+            <w:r>
+              <w:rPr>
+                <w:noProof/>
+                <w:webHidden/>
+              </w:rPr>
+              <w:fldChar w:fldCharType="separate"/>
+            </w:r>
+            <w:r>
+              <w:rPr>
+                <w:noProof/>
+                <w:webHidden/>
+              </w:rPr>
+              <w:t>12</w:t>
+            </w:r>
+            <w:r>
+              <w:rPr>
+                <w:noProof/>
+                <w:webHidden/>
+              </w:rPr>
+              <w:fldChar w:fldCharType="end"/>
+            </w:r>
+          </w:hyperlink>
+        </w:p>
+        <w:p>
+          <w:pPr>
+            <w:pStyle w:val="TOC2"/>
+            <w:tabs>
+              <w:tab w:val="right" w:leader="dot" w:pos="9350"/>
+            </w:tabs>
+            <w:rPr>
+              <w:noProof/>
+              <w:kern w:val="2"/>
+              <w:lang w:eastAsia="en-US"/>
+              <w14:ligatures w14:val="standardContextual"/>
+            </w:rPr>
+          </w:pPr>
+          <w:hyperlink w:anchor="_Toc235630429" w:history="1">
+            <w:r>
+              <w:rPr>
+                <w:rStyle w:val="Hyperlink"/>
+                <w:noProof/>
+              </w:rPr>
+              <w:t>Prepared Dataset</w:t>
+            </w:r>
+            <w:r>
+              <w:rPr>
+                <w:noProof/>
+                <w:webHidden/>
+              </w:rPr>
+              <w:tab/>
+            </w:r>
+            <w:r>
+              <w:rPr>
+                <w:noProof/>
+                <w:webHidden/>
+              </w:rPr>
+              <w:fldChar w:fldCharType="begin"/>
+            </w:r>
+            <w:r>
+              <w:rPr>
+                <w:noProof/>
+                <w:webHidden/>
+              </w:rPr>
+              <w:instrText xml:space="preserve"> PAGEREF _Toc235630429 \h </w:instrText>
+            </w:r>
+            <w:r>
+              <w:rPr>
+                <w:noProof/>
+                <w:webHidden/>
+              </w:rPr>
+            </w:r>
+            <w:r>
+              <w:rPr>
+                <w:noProof/>
+                <w:webHidden/>
+              </w:rPr>
+              <w:fldChar w:fldCharType="separate"/>
+            </w:r>
+            <w:r>
+              <w:rPr>
+                <w:noProof/>
+                <w:webHidden/>
+              </w:rPr>
+              <w:t>13</w:t>
             </w:r>
             <w:r>
               <w:rPr>
@@ -959,12 +1316,439 @@
               <w14:ligatures w14:val="standardContextual"/>
             </w:rPr>
           </w:pPr>
-          <w:hyperlink w:anchor="_Toc235626558" w:history="1">
+          <w:hyperlink w:anchor="_Toc235630430" w:history="1">
             <w:r>
               <w:rPr>
                 <w:rStyle w:val="Hyperlink"/>
                 <w:noProof/>
               </w:rPr>
+              <w:t>Modeling</w:t>
+            </w:r>
+            <w:r>
+              <w:rPr>
+                <w:noProof/>
+                <w:webHidden/>
+              </w:rPr>
+              <w:tab/>
+            </w:r>
+            <w:r>
+              <w:rPr>
+                <w:noProof/>
+                <w:webHidden/>
+              </w:rPr>
+              <w:fldChar w:fldCharType="begin"/>
+            </w:r>
+            <w:r>
+              <w:rPr>
+                <w:noProof/>
+                <w:webHidden/>
+              </w:rPr>
+              <w:instrText xml:space="preserve"> PAGEREF _Toc235630430 \h </w:instrText>
+            </w:r>
+            <w:r>
+              <w:rPr>
+                <w:noProof/>
+                <w:webHidden/>
+              </w:rPr>
+            </w:r>
+            <w:r>
+              <w:rPr>
+                <w:noProof/>
+                <w:webHidden/>
+              </w:rPr>
+              <w:fldChar w:fldCharType="separate"/>
+            </w:r>
+            <w:r>
+              <w:rPr>
+                <w:noProof/>
+                <w:webHidden/>
+              </w:rPr>
+              <w:t>13</w:t>
+            </w:r>
+            <w:r>
+              <w:rPr>
+                <w:noProof/>
+                <w:webHidden/>
+              </w:rPr>
+              <w:fldChar w:fldCharType="end"/>
+            </w:r>
+          </w:hyperlink>
+        </w:p>
+        <w:p>
+          <w:pPr>
+            <w:pStyle w:val="TOC2"/>
+            <w:tabs>
+              <w:tab w:val="right" w:leader="dot" w:pos="9350"/>
+            </w:tabs>
+            <w:rPr>
+              <w:noProof/>
+              <w:kern w:val="2"/>
+              <w:lang w:eastAsia="en-US"/>
+              <w14:ligatures w14:val="standardContextual"/>
+            </w:rPr>
+          </w:pPr>
+          <w:hyperlink w:anchor="_Toc235630431" w:history="1">
+            <w:r>
+              <w:rPr>
+                <w:rStyle w:val="Hyperlink"/>
+                <w:noProof/>
+              </w:rPr>
+              <w:t>Logistic Regression</w:t>
+            </w:r>
+            <w:r>
+              <w:rPr>
+                <w:noProof/>
+                <w:webHidden/>
+              </w:rPr>
+              <w:tab/>
+            </w:r>
+            <w:r>
+              <w:rPr>
+                <w:noProof/>
+                <w:webHidden/>
+              </w:rPr>
+              <w:fldChar w:fldCharType="begin"/>
+            </w:r>
+            <w:r>
+              <w:rPr>
+                <w:noProof/>
+                <w:webHidden/>
+              </w:rPr>
+              <w:instrText xml:space="preserve"> PAGEREF _Toc235630431 \h </w:instrText>
+            </w:r>
+            <w:r>
+              <w:rPr>
+                <w:noProof/>
+                <w:webHidden/>
+              </w:rPr>
+            </w:r>
+            <w:r>
+              <w:rPr>
+                <w:noProof/>
+                <w:webHidden/>
+              </w:rPr>
+              <w:fldChar w:fldCharType="separate"/>
+            </w:r>
+            <w:r>
+              <w:rPr>
+                <w:noProof/>
+                <w:webHidden/>
+              </w:rPr>
+              <w:t>13</w:t>
+            </w:r>
+            <w:r>
+              <w:rPr>
+                <w:noProof/>
+                <w:webHidden/>
+              </w:rPr>
+              <w:fldChar w:fldCharType="end"/>
+            </w:r>
+          </w:hyperlink>
+        </w:p>
+        <w:p>
+          <w:pPr>
+            <w:pStyle w:val="TOC2"/>
+            <w:tabs>
+              <w:tab w:val="right" w:leader="dot" w:pos="9350"/>
+            </w:tabs>
+            <w:rPr>
+              <w:noProof/>
+              <w:kern w:val="2"/>
+              <w:lang w:eastAsia="en-US"/>
+              <w14:ligatures w14:val="standardContextual"/>
+            </w:rPr>
+          </w:pPr>
+          <w:hyperlink w:anchor="_Toc235630432" w:history="1">
+            <w:r>
+              <w:rPr>
+                <w:rStyle w:val="Hyperlink"/>
+                <w:noProof/>
+              </w:rPr>
+              <w:t>K-Nearest Neighbor</w:t>
+            </w:r>
+            <w:r>
+              <w:rPr>
+                <w:noProof/>
+                <w:webHidden/>
+              </w:rPr>
+              <w:tab/>
+            </w:r>
+            <w:r>
+              <w:rPr>
+                <w:noProof/>
+                <w:webHidden/>
+              </w:rPr>
+              <w:fldChar w:fldCharType="begin"/>
+            </w:r>
+            <w:r>
+              <w:rPr>
+                <w:noProof/>
+                <w:webHidden/>
+              </w:rPr>
+              <w:instrText xml:space="preserve"> PAGEREF _Toc235630432 \h </w:instrText>
+            </w:r>
+            <w:r>
+              <w:rPr>
+                <w:noProof/>
+                <w:webHidden/>
+              </w:rPr>
+            </w:r>
+            <w:r>
+              <w:rPr>
+                <w:noProof/>
+                <w:webHidden/>
+              </w:rPr>
+              <w:fldChar w:fldCharType="separate"/>
+            </w:r>
+            <w:r>
+              <w:rPr>
+                <w:noProof/>
+                <w:webHidden/>
+              </w:rPr>
+              <w:t>13</w:t>
+            </w:r>
+            <w:r>
+              <w:rPr>
+                <w:noProof/>
+                <w:webHidden/>
+              </w:rPr>
+              <w:fldChar w:fldCharType="end"/>
+            </w:r>
+          </w:hyperlink>
+        </w:p>
+        <w:p>
+          <w:pPr>
+            <w:pStyle w:val="TOC1"/>
+            <w:tabs>
+              <w:tab w:val="right" w:leader="dot" w:pos="9350"/>
+            </w:tabs>
+            <w:rPr>
+              <w:noProof/>
+              <w:kern w:val="2"/>
+              <w:lang w:eastAsia="en-US"/>
+              <w14:ligatures w14:val="standardContextual"/>
+            </w:rPr>
+          </w:pPr>
+          <w:hyperlink w:anchor="_Toc235630433" w:history="1">
+            <w:r>
+              <w:rPr>
+                <w:rStyle w:val="Hyperlink"/>
+                <w:noProof/>
+              </w:rPr>
+              <w:t>Evaluation</w:t>
+            </w:r>
+            <w:r>
+              <w:rPr>
+                <w:noProof/>
+                <w:webHidden/>
+              </w:rPr>
+              <w:tab/>
+            </w:r>
+            <w:r>
+              <w:rPr>
+                <w:noProof/>
+                <w:webHidden/>
+              </w:rPr>
+              <w:fldChar w:fldCharType="begin"/>
+            </w:r>
+            <w:r>
+              <w:rPr>
+                <w:noProof/>
+                <w:webHidden/>
+              </w:rPr>
+              <w:instrText xml:space="preserve"> PAGEREF _Toc235630433 \h </w:instrText>
+            </w:r>
+            <w:r>
+              <w:rPr>
+                <w:noProof/>
+                <w:webHidden/>
+              </w:rPr>
+            </w:r>
+            <w:r>
+              <w:rPr>
+                <w:noProof/>
+                <w:webHidden/>
+              </w:rPr>
+              <w:fldChar w:fldCharType="separate"/>
+            </w:r>
+            <w:r>
+              <w:rPr>
+                <w:noProof/>
+                <w:webHidden/>
+              </w:rPr>
+              <w:t>13</w:t>
+            </w:r>
+            <w:r>
+              <w:rPr>
+                <w:noProof/>
+                <w:webHidden/>
+              </w:rPr>
+              <w:fldChar w:fldCharType="end"/>
+            </w:r>
+          </w:hyperlink>
+        </w:p>
+        <w:p>
+          <w:pPr>
+            <w:pStyle w:val="TOC1"/>
+            <w:tabs>
+              <w:tab w:val="right" w:leader="dot" w:pos="9350"/>
+            </w:tabs>
+            <w:rPr>
+              <w:noProof/>
+              <w:kern w:val="2"/>
+              <w:lang w:eastAsia="en-US"/>
+              <w14:ligatures w14:val="standardContextual"/>
+            </w:rPr>
+          </w:pPr>
+          <w:hyperlink w:anchor="_Toc235630434" w:history="1">
+            <w:r>
+              <w:rPr>
+                <w:rStyle w:val="Hyperlink"/>
+                <w:noProof/>
+                <w:shd w:val="clear" w:color="auto" w:fill="FFFFFF"/>
+              </w:rPr>
+              <w:t>Deployment</w:t>
+            </w:r>
+            <w:r>
+              <w:rPr>
+                <w:noProof/>
+                <w:webHidden/>
+              </w:rPr>
+              <w:tab/>
+            </w:r>
+            <w:r>
+              <w:rPr>
+                <w:noProof/>
+                <w:webHidden/>
+              </w:rPr>
+              <w:fldChar w:fldCharType="begin"/>
+            </w:r>
+            <w:r>
+              <w:rPr>
+                <w:noProof/>
+                <w:webHidden/>
+              </w:rPr>
+              <w:instrText xml:space="preserve"> PAGEREF _Toc235630434 \h </w:instrText>
+            </w:r>
+            <w:r>
+              <w:rPr>
+                <w:noProof/>
+                <w:webHidden/>
+              </w:rPr>
+            </w:r>
+            <w:r>
+              <w:rPr>
+                <w:noProof/>
+                <w:webHidden/>
+              </w:rPr>
+              <w:fldChar w:fldCharType="separate"/>
+            </w:r>
+            <w:r>
+              <w:rPr>
+                <w:noProof/>
+                <w:webHidden/>
+              </w:rPr>
+              <w:t>13</w:t>
+            </w:r>
+            <w:r>
+              <w:rPr>
+                <w:noProof/>
+                <w:webHidden/>
+              </w:rPr>
+              <w:fldChar w:fldCharType="end"/>
+            </w:r>
+          </w:hyperlink>
+        </w:p>
+        <w:p>
+          <w:pPr>
+            <w:pStyle w:val="TOC1"/>
+            <w:tabs>
+              <w:tab w:val="right" w:leader="dot" w:pos="9350"/>
+            </w:tabs>
+            <w:rPr>
+              <w:noProof/>
+              <w:kern w:val="2"/>
+              <w:lang w:eastAsia="en-US"/>
+              <w14:ligatures w14:val="standardContextual"/>
+            </w:rPr>
+          </w:pPr>
+          <w:hyperlink w:anchor="_Toc235630435" w:history="1">
+            <w:r>
+              <w:rPr>
+                <w:rStyle w:val="Hyperlink"/>
+                <w:noProof/>
+              </w:rPr>
+              <w:t>Conclusion</w:t>
+            </w:r>
+            <w:r>
+              <w:rPr>
+                <w:noProof/>
+                <w:webHidden/>
+              </w:rPr>
+              <w:tab/>
+            </w:r>
+            <w:r>
+              <w:rPr>
+                <w:noProof/>
+                <w:webHidden/>
+              </w:rPr>
+              <w:fldChar w:fldCharType="begin"/>
+            </w:r>
+            <w:r>
+              <w:rPr>
+                <w:noProof/>
+                <w:webHidden/>
+              </w:rPr>
+              <w:instrText xml:space="preserve"> PAGEREF _Toc235630435 \h </w:instrText>
+            </w:r>
+            <w:r>
+              <w:rPr>
+                <w:noProof/>
+                <w:webHidden/>
+              </w:rPr>
+            </w:r>
+            <w:r>
+              <w:rPr>
+                <w:noProof/>
+                <w:webHidden/>
+              </w:rPr>
+              <w:fldChar w:fldCharType="separate"/>
+            </w:r>
+            <w:r>
+              <w:rPr>
+                <w:noProof/>
+                <w:webHidden/>
+              </w:rPr>
+              <w:t>13</w:t>
+            </w:r>
+            <w:r>
+              <w:rPr>
+                <w:noProof/>
+                <w:webHidden/>
+              </w:rPr>
+              <w:fldChar w:fldCharType="end"/>
+            </w:r>
+          </w:hyperlink>
+        </w:p>
+        <w:p>
+          <w:pPr>
+            <w:pStyle w:val="TOC1"/>
+            <w:tabs>
+              <w:tab w:val="right" w:leader="dot" w:pos="9350"/>
+            </w:tabs>
+            <w:rPr>
+              <w:noProof/>
+              <w:kern w:val="2"/>
+              <w:lang w:eastAsia="en-US"/>
+              <w14:ligatures w14:val="standardContextual"/>
+            </w:rPr>
+          </w:pPr>
+          <w:hyperlink w:anchor="_Toc235630436" w:history="1">
+            <w:r>
+              <w:rPr>
+                <w:rStyle w:val="Hyperlink"/>
+                <w:noProof/>
+              </w:rPr>
               <w:t>References</w:t>
             </w:r>
             <w:r>
@@ -986,7 +1770,7 @@
                 <w:noProof/>
                 <w:webHidden/>
               </w:rPr>
-              <w:instrText xml:space="preserve"> PAGEREF _Toc235626558 \h </w:instrText>
+              <w:instrText xml:space="preserve"> PAGEREF _Toc235630436 \h </w:instrText>
             </w:r>
             <w:r>
               <w:rPr>
@@ -1006,7 +1790,7 @@
                 <w:noProof/>
                 <w:webHidden/>
               </w:rPr>
-              <w:t>12</w:t>
+              <w:t>14</w:t>
             </w:r>
             <w:r>
               <w:rPr>
@@ -1033,13 +1817,22 @@
       </w:sdtContent>
     </w:sdt>
     <w:p/>
-    <w:bookmarkStart w:id="0" w:name="_Toc235626546"/>
+    <w:bookmarkStart w:id="0" w:name="_Toc235630413"/>
     <w:p>
       <w:pPr>
         <w:pStyle w:val="SectionTitle"/>
+        <w:rPr>
+          <w:b/>
+          <w:bCs/>
+        </w:rPr>
       </w:pPr>
       <w:sdt>
         <w:sdtPr>
+          <w:rPr>
+            <w:rStyle w:val="Heading1Char"/>
+            <w:b w:val="0"/>
+            <w:bCs w:val="0"/>
+          </w:rPr>
           <w:alias w:val="Title"/>
           <w:tag w:val=""/>
           <w:id w:val="-1756435886"/>
@@ -1052,7 +1845,12 @@
         </w:sdtPr>
         <w:sdtContent>
           <w:r>
-            <w:t>ADTA 4230 Final Project Report – An Analysis on Covid Testing</w:t>
+            <w:rPr>
+              <w:rStyle w:val="Heading1Char"/>
+              <w:b w:val="0"/>
+              <w:bCs w:val="0"/>
+            </w:rPr>
+            <w:t>An Analysis on Covid Testing</w:t>
           </w:r>
         </w:sdtContent>
       </w:sdt>
@@ -1067,6 +1865,16 @@
       </w:r>
     </w:p>
     <w:p>
+      <w:pPr>
+        <w:pStyle w:val="Heading2"/>
+      </w:pPr>
+      <w:bookmarkStart w:id="1" w:name="_Toc235630414"/>
+      <w:r>
+        <w:t>Business Understanding</w:t>
+      </w:r>
+      <w:bookmarkEnd w:id="1"/>
+    </w:p>
+    <w:p>
       <w:r>
         <w:t xml:space="preserve">This project uses COVID-19 symptom data. Columns within the dataset map to symptoms and binary values indicate the presence of said symptom where a value of 1 means the symptom is reported. Each tuple (row) is mapped to one patient. The result column is the target variable. </w:t>
       </w:r>
@@ -1083,33 +1891,46 @@
       </w:r>
     </w:p>
     <w:p>
-      <w:r>
-        <w:t xml:space="preserve">The models will be analyzed to extrapolate many important insights. The first question aimed to be answered is which symptom correlates the strongest with a positive COVID-19 result. Next, the information provided by the models will be used to determine if symptom data alone is sufficient in diagnosing an individual. Lastly, through comparison of the models, the last </w:t>
+      <w:pPr>
+        <w:pStyle w:val="Heading2"/>
+      </w:pPr>
+      <w:bookmarkStart w:id="2" w:name="_Toc235630415"/>
+      <w:r>
+        <w:t>Analytics questions</w:t>
+      </w:r>
+      <w:bookmarkEnd w:id="2"/>
+    </w:p>
+    <w:p>
+      <w:r>
+        <w:t xml:space="preserve">The models will be analyzed to extrapolate many important insights. The first question aimed to be answered is which symptom correlates the strongest with a positive COVID-19 </w:t>
       </w:r>
       <w:r>
         <w:lastRenderedPageBreak/>
-        <w:t>question aimed to be answered is which of the two algorithms provides the best performance when it comes to classification. The purpose of answering these questions is to give a supplemental tool to healthcare workings</w:t>
+        <w:t>result. Next, the information provided by the models will be used to determine if symptom data alone is sufficient in diagnosing an individual. Lastly, through comparison of the models, the last question aimed to be answered is which of the two algorithms provides the best performance when it comes to classification. The purpose of answering these questions is to give a supplemental tool to healthcare work</w:t>
+      </w:r>
+      <w:r>
+        <w:t>ers.</w:t>
       </w:r>
     </w:p>
     <w:p>
       <w:pPr>
         <w:pStyle w:val="Heading1"/>
       </w:pPr>
-      <w:bookmarkStart w:id="1" w:name="_Toc235626547"/>
+      <w:bookmarkStart w:id="3" w:name="_Toc235630416"/>
       <w:r>
         <w:t>Data understanding/EDA</w:t>
       </w:r>
-      <w:bookmarkEnd w:id="1"/>
+      <w:bookmarkEnd w:id="3"/>
     </w:p>
     <w:p>
       <w:pPr>
         <w:pStyle w:val="Heading2"/>
       </w:pPr>
-      <w:bookmarkStart w:id="2" w:name="_Toc235626548"/>
+      <w:bookmarkStart w:id="4" w:name="_Toc235630417"/>
       <w:r>
         <w:t>Dataset Overview</w:t>
       </w:r>
-      <w:bookmarkEnd w:id="2"/>
+      <w:bookmarkEnd w:id="4"/>
     </w:p>
     <w:p>
       <w:r>
@@ -1148,11 +1969,12 @@
       <w:pPr>
         <w:pStyle w:val="Heading2"/>
       </w:pPr>
-      <w:bookmarkStart w:id="3" w:name="_Toc235626549"/>
-      <w:r>
+      <w:bookmarkStart w:id="5" w:name="_Toc235630418"/>
+      <w:r>
+        <w:lastRenderedPageBreak/>
         <w:t>Missing Data Analysis</w:t>
       </w:r>
-      <w:bookmarkEnd w:id="3"/>
+      <w:bookmarkEnd w:id="5"/>
     </w:p>
     <w:p>
       <w:pPr>
@@ -1194,11 +2016,10 @@
         <w:rPr>
           <w:noProof/>
         </w:rPr>
-        <w:lastRenderedPageBreak/>
         <w:drawing>
-          <wp:inline distT="0" distB="0" distL="0" distR="0" wp14:anchorId="6784CB3B" wp14:editId="61996581">
-            <wp:extent cx="5816600" cy="3454400"/>
-            <wp:effectExtent l="0" t="0" r="0" b="0"/>
+          <wp:inline distT="0" distB="0" distL="0" distR="0" wp14:anchorId="6784CB3B" wp14:editId="5FB0B54C">
+            <wp:extent cx="4508500" cy="2677537"/>
+            <wp:effectExtent l="0" t="0" r="0" b="2540"/>
             <wp:docPr id="2015236644" name="Picture 2"/>
             <wp:cNvGraphicFramePr>
               <a:graphicFrameLocks xmlns:a="http://schemas.openxmlformats.org/drawingml/2006/main" noChangeAspect="1"/>
@@ -1225,7 +2046,7 @@
                   <pic:spPr>
                     <a:xfrm>
                       <a:off x="0" y="0"/>
-                      <a:ext cx="5816600" cy="3454400"/>
+                      <a:ext cx="4608963" cy="2737200"/>
                     </a:xfrm>
                     <a:prstGeom prst="rect">
                       <a:avLst/>
@@ -1334,14 +2155,14 @@
           <w:lang w:eastAsia="en-US"/>
         </w:rPr>
       </w:pPr>
-      <w:bookmarkStart w:id="4" w:name="_Toc235626550"/>
+      <w:bookmarkStart w:id="6" w:name="_Toc235630419"/>
       <w:r>
         <w:rPr>
           <w:lang w:eastAsia="en-US"/>
         </w:rPr>
         <w:t>Target Variable</w:t>
       </w:r>
-      <w:bookmarkEnd w:id="4"/>
+      <w:bookmarkEnd w:id="6"/>
     </w:p>
     <w:p>
       <w:pPr>
@@ -1392,8 +2213,8 @@
         </w:rPr>
         <w:lastRenderedPageBreak/>
         <w:drawing>
-          <wp:inline distT="0" distB="0" distL="0" distR="0" wp14:anchorId="501EA512" wp14:editId="21E176DB">
-            <wp:extent cx="5943600" cy="2376170"/>
+          <wp:inline distT="0" distB="0" distL="0" distR="0" wp14:anchorId="501EA512" wp14:editId="0120BAF3">
+            <wp:extent cx="4572000" cy="2376170"/>
             <wp:effectExtent l="0" t="0" r="0" b="0"/>
             <wp:docPr id="284409728" name="Picture 3"/>
             <wp:cNvGraphicFramePr>
@@ -1421,7 +2242,7 @@
                   <pic:spPr>
                     <a:xfrm>
                       <a:off x="0" y="0"/>
-                      <a:ext cx="6086737" cy="2433394"/>
+                      <a:ext cx="4682105" cy="2433394"/>
                     </a:xfrm>
                     <a:prstGeom prst="rect">
                       <a:avLst/>
@@ -1446,14 +2267,14 @@
           <w:lang w:eastAsia="en-US"/>
         </w:rPr>
       </w:pPr>
-      <w:bookmarkStart w:id="5" w:name="_Toc235626551"/>
+      <w:bookmarkStart w:id="7" w:name="_Toc235630420"/>
       <w:r>
         <w:rPr>
           <w:lang w:eastAsia="en-US"/>
         </w:rPr>
         <w:t>Symptom Frequencies</w:t>
       </w:r>
-      <w:bookmarkEnd w:id="5"/>
+      <w:bookmarkEnd w:id="7"/>
     </w:p>
     <w:p>
       <w:pPr>
@@ -1503,9 +2324,9 @@
           <w:lang w:eastAsia="en-US"/>
         </w:rPr>
         <w:drawing>
-          <wp:inline distT="0" distB="0" distL="0" distR="0" wp14:anchorId="5CC2C1A8" wp14:editId="0EEC7F6F">
-            <wp:extent cx="5943600" cy="3033395"/>
-            <wp:effectExtent l="0" t="0" r="0" b="1905"/>
+          <wp:inline distT="0" distB="0" distL="0" distR="0" wp14:anchorId="5CC2C1A8" wp14:editId="73E707BC">
+            <wp:extent cx="4703121" cy="2400300"/>
+            <wp:effectExtent l="0" t="0" r="0" b="0"/>
             <wp:docPr id="569185880" name="Picture 4"/>
             <wp:cNvGraphicFramePr>
               <a:graphicFrameLocks xmlns:a="http://schemas.openxmlformats.org/drawingml/2006/main" noChangeAspect="1"/>
@@ -1532,7 +2353,7 @@
                   <pic:spPr>
                     <a:xfrm>
                       <a:off x="0" y="0"/>
-                      <a:ext cx="5999745" cy="3062049"/>
+                      <a:ext cx="4772196" cy="2435553"/>
                     </a:xfrm>
                     <a:prstGeom prst="rect">
                       <a:avLst/>
@@ -1571,14 +2392,14 @@
           <w:lang w:eastAsia="en-US"/>
         </w:rPr>
       </w:pPr>
-      <w:bookmarkStart w:id="6" w:name="_Toc235626552"/>
+      <w:bookmarkStart w:id="8" w:name="_Toc235630421"/>
       <w:r>
         <w:rPr>
           <w:lang w:eastAsia="en-US"/>
         </w:rPr>
         <w:t>Relationship Between Symptoms and Test Results</w:t>
       </w:r>
-      <w:bookmarkEnd w:id="6"/>
+      <w:bookmarkEnd w:id="8"/>
     </w:p>
     <w:p>
       <w:pPr>
@@ -1697,14 +2518,14 @@
           <w:lang w:eastAsia="en-US"/>
         </w:rPr>
       </w:pPr>
-      <w:bookmarkStart w:id="7" w:name="_Toc235626553"/>
+      <w:bookmarkStart w:id="9" w:name="_Toc235630422"/>
       <w:r>
         <w:rPr>
           <w:lang w:eastAsia="en-US"/>
         </w:rPr>
         <w:t>Contact vs. Test Result</w:t>
       </w:r>
-      <w:bookmarkEnd w:id="7"/>
+      <w:bookmarkEnd w:id="9"/>
     </w:p>
     <w:p>
       <w:pPr>
@@ -1755,9 +2576,9 @@
           <w:lang w:eastAsia="en-US"/>
         </w:rPr>
         <w:drawing>
-          <wp:inline distT="0" distB="0" distL="0" distR="0" wp14:anchorId="143D377F" wp14:editId="5E82D5B2">
-            <wp:extent cx="4353339" cy="3200400"/>
-            <wp:effectExtent l="0" t="0" r="3175" b="0"/>
+          <wp:inline distT="0" distB="0" distL="0" distR="0" wp14:anchorId="143D377F" wp14:editId="72CE6AE0">
+            <wp:extent cx="4381500" cy="2450840"/>
+            <wp:effectExtent l="0" t="0" r="0" b="635"/>
             <wp:docPr id="700293948" name="Picture 6"/>
             <wp:cNvGraphicFramePr>
               <a:graphicFrameLocks xmlns:a="http://schemas.openxmlformats.org/drawingml/2006/main" noChangeAspect="1"/>
@@ -1784,7 +2605,7 @@
                   <pic:spPr>
                     <a:xfrm>
                       <a:off x="0" y="0"/>
-                      <a:ext cx="4368180" cy="3211311"/>
+                      <a:ext cx="4827323" cy="2700216"/>
                     </a:xfrm>
                     <a:prstGeom prst="rect">
                       <a:avLst/>
@@ -1817,14 +2638,14 @@
           <w:lang w:eastAsia="en-US"/>
         </w:rPr>
       </w:pPr>
-      <w:bookmarkStart w:id="8" w:name="_Toc235626554"/>
+      <w:bookmarkStart w:id="10" w:name="_Toc235630423"/>
       <w:r>
         <w:rPr>
           <w:lang w:eastAsia="en-US"/>
         </w:rPr>
         <w:t>Correlation Analysis</w:t>
       </w:r>
-      <w:bookmarkEnd w:id="8"/>
+      <w:bookmarkEnd w:id="10"/>
     </w:p>
     <w:p>
       <w:pPr>
@@ -1873,11 +2694,10 @@
           <w:noProof/>
           <w:lang w:eastAsia="en-US"/>
         </w:rPr>
-        <w:lastRenderedPageBreak/>
         <w:drawing>
-          <wp:inline distT="0" distB="0" distL="0" distR="0" wp14:anchorId="5FBFE0B4" wp14:editId="7A9C7008">
-            <wp:extent cx="4343400" cy="3774953"/>
-            <wp:effectExtent l="0" t="0" r="0" b="0"/>
+          <wp:inline distT="0" distB="0" distL="0" distR="0" wp14:anchorId="5FBFE0B4" wp14:editId="133852D5">
+            <wp:extent cx="4381500" cy="2374265"/>
+            <wp:effectExtent l="0" t="0" r="0" b="635"/>
             <wp:docPr id="1454117036" name="Picture 7"/>
             <wp:cNvGraphicFramePr>
               <a:graphicFrameLocks xmlns:a="http://schemas.openxmlformats.org/drawingml/2006/main" noChangeAspect="1"/>
@@ -1904,7 +2724,7 @@
                   <pic:spPr>
                     <a:xfrm>
                       <a:off x="0" y="0"/>
-                      <a:ext cx="4390211" cy="3815638"/>
+                      <a:ext cx="4673660" cy="2532582"/>
                     </a:xfrm>
                     <a:prstGeom prst="rect">
                       <a:avLst/>
@@ -1927,6 +2747,7 @@
         <w:rPr>
           <w:lang w:eastAsia="en-US"/>
         </w:rPr>
+        <w:lastRenderedPageBreak/>
         <w:t xml:space="preserve">The correlation matrix shows that most predictor variables have weak positive correlations with one another, suggesting that each variable uniquely correlates to a positive test result. The strongest relationship with the target variable is </w:t>
       </w:r>
       <w:r>
@@ -1979,14 +2800,14 @@
           <w:lang w:eastAsia="en-US"/>
         </w:rPr>
       </w:pPr>
-      <w:bookmarkStart w:id="9" w:name="_Toc235626555"/>
+      <w:bookmarkStart w:id="11" w:name="_Toc235630424"/>
       <w:r>
         <w:rPr>
           <w:lang w:eastAsia="en-US"/>
         </w:rPr>
         <w:t>Age (60+) vs. Test Result</w:t>
       </w:r>
-      <w:bookmarkEnd w:id="9"/>
+      <w:bookmarkEnd w:id="11"/>
     </w:p>
     <w:p>
       <w:pPr>
@@ -2035,7 +2856,6 @@
           <w:noProof/>
           <w:lang w:eastAsia="en-US"/>
         </w:rPr>
-        <w:lastRenderedPageBreak/>
         <w:drawing>
           <wp:inline distT="0" distB="0" distL="0" distR="0" wp14:anchorId="72E70AFF" wp14:editId="038E0683">
             <wp:extent cx="4343400" cy="3027905"/>
@@ -2125,14 +2945,15 @@
           <w:lang w:eastAsia="en-US"/>
         </w:rPr>
       </w:pPr>
-      <w:bookmarkStart w:id="10" w:name="_Toc235626556"/>
-      <w:r>
-        <w:rPr>
-          <w:lang w:eastAsia="en-US"/>
-        </w:rPr>
+      <w:bookmarkStart w:id="12" w:name="_Toc235630425"/>
+      <w:r>
+        <w:rPr>
+          <w:lang w:eastAsia="en-US"/>
+        </w:rPr>
+        <w:lastRenderedPageBreak/>
         <w:t>Sex vs. Test Results</w:t>
       </w:r>
-      <w:bookmarkEnd w:id="10"/>
+      <w:bookmarkEnd w:id="12"/>
     </w:p>
     <w:p>
       <w:pPr>
@@ -2181,7 +3002,6 @@
           <w:noProof/>
           <w:lang w:eastAsia="en-US"/>
         </w:rPr>
-        <w:lastRenderedPageBreak/>
         <w:drawing>
           <wp:inline distT="0" distB="0" distL="0" distR="0" wp14:anchorId="735DE221" wp14:editId="3E23EED4">
             <wp:extent cx="4343400" cy="3027905"/>
@@ -2245,23 +3065,310 @@
           <w:lang w:eastAsia="en-US"/>
         </w:rPr>
       </w:pPr>
-      <w:bookmarkStart w:id="11" w:name="_Toc235626557"/>
+      <w:bookmarkStart w:id="13" w:name="_Toc235630426"/>
       <w:r>
         <w:rPr>
           <w:lang w:eastAsia="en-US"/>
         </w:rPr>
         <w:t>Data preparation</w:t>
       </w:r>
-      <w:bookmarkEnd w:id="11"/>
-    </w:p>
-    <w:p>
-      <w:pPr>
-        <w:rPr>
-          <w:lang w:eastAsia="en-US"/>
-        </w:rPr>
-      </w:pPr>
-    </w:p>
-    <w:bookmarkStart w:id="12" w:name="_Toc235626558" w:displacedByCustomXml="next"/>
+      <w:bookmarkEnd w:id="13"/>
+    </w:p>
+    <w:p>
+      <w:pPr>
+        <w:pStyle w:val="Heading2"/>
+        <w:rPr>
+          <w:lang w:eastAsia="en-US"/>
+        </w:rPr>
+      </w:pPr>
+      <w:bookmarkStart w:id="14" w:name="_Toc235630427"/>
+      <w:r>
+        <w:rPr>
+          <w:lang w:eastAsia="en-US"/>
+        </w:rPr>
+        <w:t>Missing Data Handling</w:t>
+      </w:r>
+      <w:bookmarkEnd w:id="14"/>
+    </w:p>
+    <w:p>
+      <w:pPr>
+        <w:rPr>
+          <w:rFonts w:ascii="Times New Roman" w:eastAsia="Times New Roman" w:hAnsi="Times New Roman" w:cs="Times New Roman"/>
+          <w:kern w:val="0"/>
+          <w:lang w:eastAsia="en-US"/>
+        </w:rPr>
+      </w:pPr>
+      <w:r>
+        <w:rPr>
+          <w:lang w:eastAsia="en-US"/>
+        </w:rPr>
+        <w:t xml:space="preserve">Before the models were created, the data was clean to improve the quality. During the preliminary stages of the exploratory data analysis, missing values were identified. Two categories were observed to contain missing values. These values were </w:t>
+      </w:r>
+      <w:r>
+        <w:rPr>
+          <w:rFonts w:ascii="Times New Roman" w:eastAsia="Times New Roman" w:hAnsi="Times New Roman" w:cs="Times New Roman"/>
+          <w:i/>
+          <w:iCs/>
+          <w:kern w:val="0"/>
+          <w:lang w:eastAsia="en-US"/>
+        </w:rPr>
+        <w:t>Age_60_And_Above</w:t>
+      </w:r>
+      <w:r>
+        <w:rPr>
+          <w:rFonts w:ascii="Times New Roman" w:eastAsia="Times New Roman" w:hAnsi="Times New Roman" w:cs="Times New Roman"/>
+          <w:kern w:val="0"/>
+          <w:lang w:eastAsia="en-US"/>
+        </w:rPr>
+        <w:t xml:space="preserve"> and </w:t>
+      </w:r>
+      <w:r>
+        <w:rPr>
+          <w:rFonts w:ascii="Times New Roman" w:eastAsia="Times New Roman" w:hAnsi="Times New Roman" w:cs="Times New Roman"/>
+          <w:i/>
+          <w:iCs/>
+          <w:kern w:val="0"/>
+          <w:lang w:eastAsia="en-US"/>
+        </w:rPr>
+        <w:lastRenderedPageBreak/>
+        <w:t>Sex</w:t>
+      </w:r>
+      <w:r>
+        <w:rPr>
+          <w:rFonts w:ascii="Times New Roman" w:eastAsia="Times New Roman" w:hAnsi="Times New Roman" w:cs="Times New Roman"/>
+          <w:kern w:val="0"/>
+          <w:lang w:eastAsia="en-US"/>
+        </w:rPr>
+        <w:t>.</w:t>
+      </w:r>
+      <w:r>
+        <w:rPr>
+          <w:rFonts w:ascii="Times New Roman" w:eastAsia="Times New Roman" w:hAnsi="Times New Roman" w:cs="Times New Roman"/>
+          <w:kern w:val="0"/>
+          <w:lang w:eastAsia="en-US"/>
+        </w:rPr>
+        <w:t xml:space="preserve"> Missing age values affected approximately 4.8% of patients. Less than 1% of records from patients were missing sex.</w:t>
+      </w:r>
+    </w:p>
+    <w:p>
+      <w:pPr>
+        <w:rPr>
+          <w:lang w:eastAsia="en-US"/>
+        </w:rPr>
+      </w:pPr>
+      <w:r>
+        <w:rPr>
+          <w:rFonts w:ascii="Times New Roman" w:eastAsia="Times New Roman" w:hAnsi="Times New Roman" w:cs="Times New Roman"/>
+          <w:kern w:val="0"/>
+          <w:lang w:eastAsia="en-US"/>
+        </w:rPr>
+        <w:t>Since affected patients with missing data represented less than 5% of the total dataset, these records were removed from the dataset.</w:t>
+      </w:r>
+      <w:r>
+        <w:rPr>
+          <w:rFonts w:ascii="Times New Roman" w:eastAsia="Times New Roman" w:hAnsi="Times New Roman" w:cs="Times New Roman"/>
+          <w:kern w:val="0"/>
+          <w:lang w:eastAsia="en-US"/>
+        </w:rPr>
+        <w:t xml:space="preserve"> Mean values were not considered since the missing values represented categorial instead of continuous values. Before removing values, chi-square tests were used to examine the associations between missing values. It was identified if a patient was missing a gender value, they were 50% likely to be missing an age value as well. But because the overall proportion of missing values remained small, it was chosen to remove these values in place of preserving the majority. A more in-depth analysis can benefit by determining if the missing values were random in nature.</w:t>
+      </w:r>
+    </w:p>
+    <w:p>
+      <w:pPr>
+        <w:pStyle w:val="Heading2"/>
+        <w:rPr>
+          <w:lang w:eastAsia="en-US"/>
+        </w:rPr>
+      </w:pPr>
+      <w:bookmarkStart w:id="15" w:name="_Toc235630428"/>
+      <w:r>
+        <w:rPr>
+          <w:lang w:eastAsia="en-US"/>
+        </w:rPr>
+        <w:t>Variable Encoding</w:t>
+      </w:r>
+      <w:bookmarkEnd w:id="15"/>
+    </w:p>
+    <w:p>
+      <w:pPr>
+        <w:rPr>
+          <w:lang w:eastAsia="en-US"/>
+        </w:rPr>
+      </w:pPr>
+      <w:r>
+        <w:rPr>
+          <w:lang w:eastAsia="en-US"/>
+        </w:rPr>
+        <w:t xml:space="preserve">Many of the variables found within the dataset were stored as string values. To process the variables in the machine learning models, the variables were required to be mapped to a numeric form. This included converting the age, sex, and result variables. </w:t>
+      </w:r>
+    </w:p>
+    <w:p>
+      <w:pPr>
+        <w:rPr>
+          <w:lang w:eastAsia="en-US"/>
+        </w:rPr>
+      </w:pPr>
+      <w:r>
+        <w:rPr>
+          <w:lang w:eastAsia="en-US"/>
+        </w:rPr>
+        <w:t xml:space="preserve">Starting off with the age variable, </w:t>
+      </w:r>
+      <w:r>
+        <w:rPr>
+          <w:i/>
+          <w:iCs/>
+          <w:lang w:eastAsia="en-US"/>
+        </w:rPr>
+        <w:t>yes</w:t>
+      </w:r>
+      <w:r>
+        <w:rPr>
+          <w:lang w:eastAsia="en-US"/>
+        </w:rPr>
+        <w:t xml:space="preserve"> values which previously indicated a patient was aged sixty or older were encoded as 1. Alternatively, </w:t>
+      </w:r>
+      <w:r>
+        <w:rPr>
+          <w:i/>
+          <w:iCs/>
+          <w:lang w:eastAsia="en-US"/>
+        </w:rPr>
+        <w:t>no</w:t>
+      </w:r>
+      <w:r>
+        <w:rPr>
+          <w:lang w:eastAsia="en-US"/>
+        </w:rPr>
+        <w:t xml:space="preserve"> values were encoded as 0. For the sex variable, males were chosen to be mapped to a value of 1 and consequently females to 0. </w:t>
+      </w:r>
+      <w:r>
+        <w:rPr>
+          <w:lang w:eastAsia="en-US"/>
+        </w:rPr>
+        <w:t xml:space="preserve">Concerning the result variable, the string </w:t>
+      </w:r>
+      <w:r>
+        <w:rPr>
+          <w:i/>
+          <w:iCs/>
+          <w:lang w:eastAsia="en-US"/>
+        </w:rPr>
+        <w:t>positive</w:t>
+      </w:r>
+      <w:r>
+        <w:rPr>
+          <w:lang w:eastAsia="en-US"/>
+        </w:rPr>
+        <w:t xml:space="preserve"> was mapped to 1 and conversely </w:t>
+      </w:r>
+      <w:r>
+        <w:rPr>
+          <w:i/>
+          <w:iCs/>
+          <w:lang w:eastAsia="en-US"/>
+        </w:rPr>
+        <w:t>negative</w:t>
+      </w:r>
+      <w:r>
+        <w:rPr>
+          <w:lang w:eastAsia="en-US"/>
+        </w:rPr>
+        <w:t xml:space="preserve"> to 0. After each variable was converted to a numeral in binary form, variables were validated to ensure values only existed in the form of 1 or 0. The other remaining predictor variables already existed in this format; therefore, they required no conversion. </w:t>
+      </w:r>
+    </w:p>
+    <w:p>
+      <w:pPr>
+        <w:pStyle w:val="Heading2"/>
+      </w:pPr>
+      <w:bookmarkStart w:id="16" w:name="_Toc235630429"/>
+      <w:r>
+        <w:lastRenderedPageBreak/>
+        <w:t>Pr</w:t>
+      </w:r>
+      <w:r>
+        <w:t xml:space="preserve">epared </w:t>
+      </w:r>
+      <w:r>
+        <w:t>Dataset</w:t>
+      </w:r>
+      <w:bookmarkEnd w:id="16"/>
+    </w:p>
+    <w:p>
+      <w:r>
+        <w:t xml:space="preserve">After cleaning the dataset of missing data and encoding all variables, the dataset was comprised entirely of complete numeric binary values. All predictor variables were retained since each had a positive correlation with a positive test result. The finalized dataset served as the input for both the </w:t>
+      </w:r>
+      <w:r>
+        <w:t xml:space="preserve">Logistic Regression </w:t>
+      </w:r>
+      <w:r>
+        <w:t>and K-Nearest Neighbor models.</w:t>
+      </w:r>
+    </w:p>
+    <w:p>
+      <w:pPr>
+        <w:pStyle w:val="Heading1"/>
+      </w:pPr>
+      <w:bookmarkStart w:id="17" w:name="_Toc235630430"/>
+      <w:r>
+        <w:t>Modeling</w:t>
+      </w:r>
+      <w:bookmarkEnd w:id="17"/>
+    </w:p>
+    <w:p>
+      <w:pPr>
+        <w:pStyle w:val="Heading2"/>
+      </w:pPr>
+      <w:bookmarkStart w:id="18" w:name="_Toc235630431"/>
+      <w:r>
+        <w:t>Logistic Regression</w:t>
+      </w:r>
+      <w:bookmarkEnd w:id="18"/>
+    </w:p>
+    <w:p>
+      <w:pPr>
+        <w:pStyle w:val="Heading2"/>
+      </w:pPr>
+      <w:bookmarkStart w:id="19" w:name="_Toc235630432"/>
+      <w:r>
+        <w:t>K-Nearest Neighbor</w:t>
+      </w:r>
+      <w:bookmarkEnd w:id="19"/>
+    </w:p>
+    <w:p>
+      <w:pPr>
+        <w:pStyle w:val="Heading1"/>
+      </w:pPr>
+      <w:bookmarkStart w:id="20" w:name="_Toc235630433"/>
+      <w:r>
+        <w:t>Evaluation</w:t>
+      </w:r>
+      <w:bookmarkEnd w:id="20"/>
+    </w:p>
+    <w:p>
+      <w:pPr>
+        <w:pStyle w:val="Heading1"/>
+      </w:pPr>
+      <w:bookmarkStart w:id="21" w:name="_Toc235630434"/>
+      <w:r>
+        <w:rPr>
+          <w:shd w:val="clear" w:color="auto" w:fill="FFFFFF"/>
+        </w:rPr>
+        <w:t>Deployment</w:t>
+      </w:r>
+      <w:bookmarkEnd w:id="21"/>
+    </w:p>
+    <w:p>
+      <w:pPr>
+        <w:pStyle w:val="Heading1"/>
+      </w:pPr>
+      <w:bookmarkStart w:id="22" w:name="_Toc235630435"/>
+      <w:r>
+        <w:t>Conclusion</w:t>
+      </w:r>
+      <w:bookmarkEnd w:id="22"/>
+    </w:p>
+    <w:bookmarkStart w:id="23" w:name="_Toc235630436" w:displacedByCustomXml="next"/>
     <w:sdt>
       <w:sdtPr>
         <w:rPr>
@@ -2278,7 +3385,7 @@
           <w:r>
             <w:t>References</w:t>
           </w:r>
-          <w:bookmarkEnd w:id="12"/>
+          <w:bookmarkEnd w:id="23"/>
         </w:p>
         <w:sdt>
           <w:sdtPr>
@@ -3439,7 +4546,6 @@
   <w:style w:type="character" w:default="1" w:styleId="DefaultParagraphFont">
     <w:name w:val="Default Paragraph Font"/>
     <w:uiPriority w:val="1"/>
-    <w:semiHidden/>
     <w:unhideWhenUsed/>
   </w:style>
   <w:style w:type="table" w:default="1" w:styleId="TableNormal">
@@ -6096,6 +7202,9 @@
   <w:style w:type="paragraph" w:customStyle="1" w:styleId="07E172FFE7C59D46AC065BEE4DA0BD59">
     <w:name w:val="07E172FFE7C59D46AC065BEE4DA0BD59"/>
   </w:style>
+  <w:style w:type="paragraph" w:customStyle="1" w:styleId="14176F5B6A38C84A80495E3A63F42139">
+    <w:name w:val="14176F5B6A38C84A80495E3A63F42139"/>
+  </w:style>
 </w:styles>
 </file>
 

</xml_diff>

<commit_message>
feat: combine original notebook with EDA noteook for more in depth analysis
</commit_message>
<xml_diff>
--- a/ADTA 4230 Final Project Report.docx
+++ b/ADTA 4230 Final Project Report.docx
@@ -99,7 +99,7 @@
           <w:r>
             <w:fldChar w:fldCharType="separate"/>
           </w:r>
-          <w:hyperlink w:anchor="_Toc235630413" w:history="1">
+          <w:hyperlink w:anchor="_Toc235644756" w:history="1">
             <w:r>
               <w:rPr>
                 <w:rStyle w:val="Hyperlink"/>
@@ -126,7 +126,7 @@
                 <w:noProof/>
                 <w:webHidden/>
               </w:rPr>
-              <w:instrText xml:space="preserve"> PAGEREF _Toc235630413 \h </w:instrText>
+              <w:instrText xml:space="preserve"> PAGEREF _Toc235644756 \h </w:instrText>
             </w:r>
             <w:r>
               <w:rPr>
@@ -170,7 +170,7 @@
               <w14:ligatures w14:val="standardContextual"/>
             </w:rPr>
           </w:pPr>
-          <w:hyperlink w:anchor="_Toc235630414" w:history="1">
+          <w:hyperlink w:anchor="_Toc235644757" w:history="1">
             <w:r>
               <w:rPr>
                 <w:rStyle w:val="Hyperlink"/>
@@ -197,7 +197,7 @@
                 <w:noProof/>
                 <w:webHidden/>
               </w:rPr>
-              <w:instrText xml:space="preserve"> PAGEREF _Toc235630414 \h </w:instrText>
+              <w:instrText xml:space="preserve"> PAGEREF _Toc235644757 \h </w:instrText>
             </w:r>
             <w:r>
               <w:rPr>
@@ -241,7 +241,7 @@
               <w14:ligatures w14:val="standardContextual"/>
             </w:rPr>
           </w:pPr>
-          <w:hyperlink w:anchor="_Toc235630415" w:history="1">
+          <w:hyperlink w:anchor="_Toc235644758" w:history="1">
             <w:r>
               <w:rPr>
                 <w:rStyle w:val="Hyperlink"/>
@@ -268,7 +268,7 @@
                 <w:noProof/>
                 <w:webHidden/>
               </w:rPr>
-              <w:instrText xml:space="preserve"> PAGEREF _Toc235630415 \h </w:instrText>
+              <w:instrText xml:space="preserve"> PAGEREF _Toc235644758 \h </w:instrText>
             </w:r>
             <w:r>
               <w:rPr>
@@ -312,7 +312,7 @@
               <w14:ligatures w14:val="standardContextual"/>
             </w:rPr>
           </w:pPr>
-          <w:hyperlink w:anchor="_Toc235630416" w:history="1">
+          <w:hyperlink w:anchor="_Toc235644759" w:history="1">
             <w:r>
               <w:rPr>
                 <w:rStyle w:val="Hyperlink"/>
@@ -339,7 +339,7 @@
                 <w:noProof/>
                 <w:webHidden/>
               </w:rPr>
-              <w:instrText xml:space="preserve"> PAGEREF _Toc235630416 \h </w:instrText>
+              <w:instrText xml:space="preserve"> PAGEREF _Toc235644759 \h </w:instrText>
             </w:r>
             <w:r>
               <w:rPr>
@@ -383,7 +383,7 @@
               <w14:ligatures w14:val="standardContextual"/>
             </w:rPr>
           </w:pPr>
-          <w:hyperlink w:anchor="_Toc235630417" w:history="1">
+          <w:hyperlink w:anchor="_Toc235644760" w:history="1">
             <w:r>
               <w:rPr>
                 <w:rStyle w:val="Hyperlink"/>
@@ -410,7 +410,7 @@
                 <w:noProof/>
                 <w:webHidden/>
               </w:rPr>
-              <w:instrText xml:space="preserve"> PAGEREF _Toc235630417 \h </w:instrText>
+              <w:instrText xml:space="preserve"> PAGEREF _Toc235644760 \h </w:instrText>
             </w:r>
             <w:r>
               <w:rPr>
@@ -454,7 +454,7 @@
               <w14:ligatures w14:val="standardContextual"/>
             </w:rPr>
           </w:pPr>
-          <w:hyperlink w:anchor="_Toc235630418" w:history="1">
+          <w:hyperlink w:anchor="_Toc235644761" w:history="1">
             <w:r>
               <w:rPr>
                 <w:rStyle w:val="Hyperlink"/>
@@ -481,7 +481,7 @@
                 <w:noProof/>
                 <w:webHidden/>
               </w:rPr>
-              <w:instrText xml:space="preserve"> PAGEREF _Toc235630418 \h </w:instrText>
+              <w:instrText xml:space="preserve"> PAGEREF _Toc235644761 \h </w:instrText>
             </w:r>
             <w:r>
               <w:rPr>
@@ -525,7 +525,7 @@
               <w14:ligatures w14:val="standardContextual"/>
             </w:rPr>
           </w:pPr>
-          <w:hyperlink w:anchor="_Toc235630419" w:history="1">
+          <w:hyperlink w:anchor="_Toc235644762" w:history="1">
             <w:r>
               <w:rPr>
                 <w:rStyle w:val="Hyperlink"/>
@@ -553,7 +553,7 @@
                 <w:noProof/>
                 <w:webHidden/>
               </w:rPr>
-              <w:instrText xml:space="preserve"> PAGEREF _Toc235630419 \h </w:instrText>
+              <w:instrText xml:space="preserve"> PAGEREF _Toc235644762 \h </w:instrText>
             </w:r>
             <w:r>
               <w:rPr>
@@ -597,7 +597,7 @@
               <w14:ligatures w14:val="standardContextual"/>
             </w:rPr>
           </w:pPr>
-          <w:hyperlink w:anchor="_Toc235630420" w:history="1">
+          <w:hyperlink w:anchor="_Toc235644763" w:history="1">
             <w:r>
               <w:rPr>
                 <w:rStyle w:val="Hyperlink"/>
@@ -625,7 +625,7 @@
                 <w:noProof/>
                 <w:webHidden/>
               </w:rPr>
-              <w:instrText xml:space="preserve"> PAGEREF _Toc235630420 \h </w:instrText>
+              <w:instrText xml:space="preserve"> PAGEREF _Toc235644763 \h </w:instrText>
             </w:r>
             <w:r>
               <w:rPr>
@@ -669,7 +669,7 @@
               <w14:ligatures w14:val="standardContextual"/>
             </w:rPr>
           </w:pPr>
-          <w:hyperlink w:anchor="_Toc235630421" w:history="1">
+          <w:hyperlink w:anchor="_Toc235644764" w:history="1">
             <w:r>
               <w:rPr>
                 <w:rStyle w:val="Hyperlink"/>
@@ -697,7 +697,7 @@
                 <w:noProof/>
                 <w:webHidden/>
               </w:rPr>
-              <w:instrText xml:space="preserve"> PAGEREF _Toc235630421 \h </w:instrText>
+              <w:instrText xml:space="preserve"> PAGEREF _Toc235644764 \h </w:instrText>
             </w:r>
             <w:r>
               <w:rPr>
@@ -741,7 +741,7 @@
               <w14:ligatures w14:val="standardContextual"/>
             </w:rPr>
           </w:pPr>
-          <w:hyperlink w:anchor="_Toc235630422" w:history="1">
+          <w:hyperlink w:anchor="_Toc235644765" w:history="1">
             <w:r>
               <w:rPr>
                 <w:rStyle w:val="Hyperlink"/>
@@ -769,7 +769,7 @@
                 <w:noProof/>
                 <w:webHidden/>
               </w:rPr>
-              <w:instrText xml:space="preserve"> PAGEREF _Toc235630422 \h </w:instrText>
+              <w:instrText xml:space="preserve"> PAGEREF _Toc235644765 \h </w:instrText>
             </w:r>
             <w:r>
               <w:rPr>
@@ -813,7 +813,7 @@
               <w14:ligatures w14:val="standardContextual"/>
             </w:rPr>
           </w:pPr>
-          <w:hyperlink w:anchor="_Toc235630423" w:history="1">
+          <w:hyperlink w:anchor="_Toc235644766" w:history="1">
             <w:r>
               <w:rPr>
                 <w:rStyle w:val="Hyperlink"/>
@@ -841,7 +841,7 @@
                 <w:noProof/>
                 <w:webHidden/>
               </w:rPr>
-              <w:instrText xml:space="preserve"> PAGEREF _Toc235630423 \h </w:instrText>
+              <w:instrText xml:space="preserve"> PAGEREF _Toc235644766 \h </w:instrText>
             </w:r>
             <w:r>
               <w:rPr>
@@ -885,7 +885,7 @@
               <w14:ligatures w14:val="standardContextual"/>
             </w:rPr>
           </w:pPr>
-          <w:hyperlink w:anchor="_Toc235630424" w:history="1">
+          <w:hyperlink w:anchor="_Toc235644767" w:history="1">
             <w:r>
               <w:rPr>
                 <w:rStyle w:val="Hyperlink"/>
@@ -913,7 +913,7 @@
                 <w:noProof/>
                 <w:webHidden/>
               </w:rPr>
-              <w:instrText xml:space="preserve"> PAGEREF _Toc235630424 \h </w:instrText>
+              <w:instrText xml:space="preserve"> PAGEREF _Toc235644767 \h </w:instrText>
             </w:r>
             <w:r>
               <w:rPr>
@@ -957,7 +957,7 @@
               <w14:ligatures w14:val="standardContextual"/>
             </w:rPr>
           </w:pPr>
-          <w:hyperlink w:anchor="_Toc235630425" w:history="1">
+          <w:hyperlink w:anchor="_Toc235644768" w:history="1">
             <w:r>
               <w:rPr>
                 <w:rStyle w:val="Hyperlink"/>
@@ -985,7 +985,7 @@
                 <w:noProof/>
                 <w:webHidden/>
               </w:rPr>
-              <w:instrText xml:space="preserve"> PAGEREF _Toc235630425 \h </w:instrText>
+              <w:instrText xml:space="preserve"> PAGEREF _Toc235644768 \h </w:instrText>
             </w:r>
             <w:r>
               <w:rPr>
@@ -1029,7 +1029,7 @@
               <w14:ligatures w14:val="standardContextual"/>
             </w:rPr>
           </w:pPr>
-          <w:hyperlink w:anchor="_Toc235630426" w:history="1">
+          <w:hyperlink w:anchor="_Toc235644769" w:history="1">
             <w:r>
               <w:rPr>
                 <w:rStyle w:val="Hyperlink"/>
@@ -1057,7 +1057,7 @@
                 <w:noProof/>
                 <w:webHidden/>
               </w:rPr>
-              <w:instrText xml:space="preserve"> PAGEREF _Toc235630426 \h </w:instrText>
+              <w:instrText xml:space="preserve"> PAGEREF _Toc235644769 \h </w:instrText>
             </w:r>
             <w:r>
               <w:rPr>
@@ -1101,7 +1101,7 @@
               <w14:ligatures w14:val="standardContextual"/>
             </w:rPr>
           </w:pPr>
-          <w:hyperlink w:anchor="_Toc235630427" w:history="1">
+          <w:hyperlink w:anchor="_Toc235644770" w:history="1">
             <w:r>
               <w:rPr>
                 <w:rStyle w:val="Hyperlink"/>
@@ -1129,7 +1129,7 @@
                 <w:noProof/>
                 <w:webHidden/>
               </w:rPr>
-              <w:instrText xml:space="preserve"> PAGEREF _Toc235630427 \h </w:instrText>
+              <w:instrText xml:space="preserve"> PAGEREF _Toc235644770 \h </w:instrText>
             </w:r>
             <w:r>
               <w:rPr>
@@ -1173,7 +1173,7 @@
               <w14:ligatures w14:val="standardContextual"/>
             </w:rPr>
           </w:pPr>
-          <w:hyperlink w:anchor="_Toc235630428" w:history="1">
+          <w:hyperlink w:anchor="_Toc235644771" w:history="1">
             <w:r>
               <w:rPr>
                 <w:rStyle w:val="Hyperlink"/>
@@ -1201,7 +1201,7 @@
                 <w:noProof/>
                 <w:webHidden/>
               </w:rPr>
-              <w:instrText xml:space="preserve"> PAGEREF _Toc235630428 \h </w:instrText>
+              <w:instrText xml:space="preserve"> PAGEREF _Toc235644771 \h </w:instrText>
             </w:r>
             <w:r>
               <w:rPr>
@@ -1245,7 +1245,7 @@
               <w14:ligatures w14:val="standardContextual"/>
             </w:rPr>
           </w:pPr>
-          <w:hyperlink w:anchor="_Toc235630429" w:history="1">
+          <w:hyperlink w:anchor="_Toc235644772" w:history="1">
             <w:r>
               <w:rPr>
                 <w:rStyle w:val="Hyperlink"/>
@@ -1272,7 +1272,7 @@
                 <w:noProof/>
                 <w:webHidden/>
               </w:rPr>
-              <w:instrText xml:space="preserve"> PAGEREF _Toc235630429 \h </w:instrText>
+              <w:instrText xml:space="preserve"> PAGEREF _Toc235644772 \h </w:instrText>
             </w:r>
             <w:r>
               <w:rPr>
@@ -1316,7 +1316,7 @@
               <w14:ligatures w14:val="standardContextual"/>
             </w:rPr>
           </w:pPr>
-          <w:hyperlink w:anchor="_Toc235630430" w:history="1">
+          <w:hyperlink w:anchor="_Toc235644773" w:history="1">
             <w:r>
               <w:rPr>
                 <w:rStyle w:val="Hyperlink"/>
@@ -1343,7 +1343,7 @@
                 <w:noProof/>
                 <w:webHidden/>
               </w:rPr>
-              <w:instrText xml:space="preserve"> PAGEREF _Toc235630430 \h </w:instrText>
+              <w:instrText xml:space="preserve"> PAGEREF _Toc235644773 \h </w:instrText>
             </w:r>
             <w:r>
               <w:rPr>
@@ -1387,7 +1387,7 @@
               <w14:ligatures w14:val="standardContextual"/>
             </w:rPr>
           </w:pPr>
-          <w:hyperlink w:anchor="_Toc235630431" w:history="1">
+          <w:hyperlink w:anchor="_Toc235644774" w:history="1">
             <w:r>
               <w:rPr>
                 <w:rStyle w:val="Hyperlink"/>
@@ -1414,7 +1414,7 @@
                 <w:noProof/>
                 <w:webHidden/>
               </w:rPr>
-              <w:instrText xml:space="preserve"> PAGEREF _Toc235630431 \h </w:instrText>
+              <w:instrText xml:space="preserve"> PAGEREF _Toc235644774 \h </w:instrText>
             </w:r>
             <w:r>
               <w:rPr>
@@ -1458,7 +1458,7 @@
               <w14:ligatures w14:val="standardContextual"/>
             </w:rPr>
           </w:pPr>
-          <w:hyperlink w:anchor="_Toc235630432" w:history="1">
+          <w:hyperlink w:anchor="_Toc235644775" w:history="1">
             <w:r>
               <w:rPr>
                 <w:rStyle w:val="Hyperlink"/>
@@ -1485,7 +1485,7 @@
                 <w:noProof/>
                 <w:webHidden/>
               </w:rPr>
-              <w:instrText xml:space="preserve"> PAGEREF _Toc235630432 \h </w:instrText>
+              <w:instrText xml:space="preserve"> PAGEREF _Toc235644775 \h </w:instrText>
             </w:r>
             <w:r>
               <w:rPr>
@@ -1529,7 +1529,7 @@
               <w14:ligatures w14:val="standardContextual"/>
             </w:rPr>
           </w:pPr>
-          <w:hyperlink w:anchor="_Toc235630433" w:history="1">
+          <w:hyperlink w:anchor="_Toc235644776" w:history="1">
             <w:r>
               <w:rPr>
                 <w:rStyle w:val="Hyperlink"/>
@@ -1556,7 +1556,7 @@
                 <w:noProof/>
                 <w:webHidden/>
               </w:rPr>
-              <w:instrText xml:space="preserve"> PAGEREF _Toc235630433 \h </w:instrText>
+              <w:instrText xml:space="preserve"> PAGEREF _Toc235644776 \h </w:instrText>
             </w:r>
             <w:r>
               <w:rPr>
@@ -1576,7 +1576,7 @@
                 <w:noProof/>
                 <w:webHidden/>
               </w:rPr>
-              <w:t>13</w:t>
+              <w:t>14</w:t>
             </w:r>
             <w:r>
               <w:rPr>
@@ -1600,7 +1600,7 @@
               <w14:ligatures w14:val="standardContextual"/>
             </w:rPr>
           </w:pPr>
-          <w:hyperlink w:anchor="_Toc235630434" w:history="1">
+          <w:hyperlink w:anchor="_Toc235644777" w:history="1">
             <w:r>
               <w:rPr>
                 <w:rStyle w:val="Hyperlink"/>
@@ -1628,7 +1628,7 @@
                 <w:noProof/>
                 <w:webHidden/>
               </w:rPr>
-              <w:instrText xml:space="preserve"> PAGEREF _Toc235630434 \h </w:instrText>
+              <w:instrText xml:space="preserve"> PAGEREF _Toc235644777 \h </w:instrText>
             </w:r>
             <w:r>
               <w:rPr>
@@ -1648,7 +1648,7 @@
                 <w:noProof/>
                 <w:webHidden/>
               </w:rPr>
-              <w:t>13</w:t>
+              <w:t>15</w:t>
             </w:r>
             <w:r>
               <w:rPr>
@@ -1672,7 +1672,7 @@
               <w14:ligatures w14:val="standardContextual"/>
             </w:rPr>
           </w:pPr>
-          <w:hyperlink w:anchor="_Toc235630435" w:history="1">
+          <w:hyperlink w:anchor="_Toc235644778" w:history="1">
             <w:r>
               <w:rPr>
                 <w:rStyle w:val="Hyperlink"/>
@@ -1699,7 +1699,7 @@
                 <w:noProof/>
                 <w:webHidden/>
               </w:rPr>
-              <w:instrText xml:space="preserve"> PAGEREF _Toc235630435 \h </w:instrText>
+              <w:instrText xml:space="preserve"> PAGEREF _Toc235644778 \h </w:instrText>
             </w:r>
             <w:r>
               <w:rPr>
@@ -1719,7 +1719,7 @@
                 <w:noProof/>
                 <w:webHidden/>
               </w:rPr>
-              <w:t>13</w:t>
+              <w:t>15</w:t>
             </w:r>
             <w:r>
               <w:rPr>
@@ -1743,7 +1743,7 @@
               <w14:ligatures w14:val="standardContextual"/>
             </w:rPr>
           </w:pPr>
-          <w:hyperlink w:anchor="_Toc235630436" w:history="1">
+          <w:hyperlink w:anchor="_Toc235644779" w:history="1">
             <w:r>
               <w:rPr>
                 <w:rStyle w:val="Hyperlink"/>
@@ -1770,7 +1770,7 @@
                 <w:noProof/>
                 <w:webHidden/>
               </w:rPr>
-              <w:instrText xml:space="preserve"> PAGEREF _Toc235630436 \h </w:instrText>
+              <w:instrText xml:space="preserve"> PAGEREF _Toc235644779 \h </w:instrText>
             </w:r>
             <w:r>
               <w:rPr>
@@ -1790,7 +1790,7 @@
                 <w:noProof/>
                 <w:webHidden/>
               </w:rPr>
-              <w:t>14</w:t>
+              <w:t>16</w:t>
             </w:r>
             <w:r>
               <w:rPr>
@@ -1817,7 +1817,7 @@
       </w:sdtContent>
     </w:sdt>
     <w:p/>
-    <w:bookmarkStart w:id="0" w:name="_Toc235630413"/>
+    <w:bookmarkStart w:id="0" w:name="_Toc235644756"/>
     <w:p>
       <w:pPr>
         <w:pStyle w:val="SectionTitle"/>
@@ -1868,7 +1868,7 @@
       <w:pPr>
         <w:pStyle w:val="Heading2"/>
       </w:pPr>
-      <w:bookmarkStart w:id="1" w:name="_Toc235630414"/>
+      <w:bookmarkStart w:id="1" w:name="_Toc235644757"/>
       <w:r>
         <w:t>Business Understanding</w:t>
       </w:r>
@@ -1894,7 +1894,7 @@
       <w:pPr>
         <w:pStyle w:val="Heading2"/>
       </w:pPr>
-      <w:bookmarkStart w:id="2" w:name="_Toc235630415"/>
+      <w:bookmarkStart w:id="2" w:name="_Toc235644758"/>
       <w:r>
         <w:t>Analytics questions</w:t>
       </w:r>
@@ -1916,7 +1916,7 @@
       <w:pPr>
         <w:pStyle w:val="Heading1"/>
       </w:pPr>
-      <w:bookmarkStart w:id="3" w:name="_Toc235630416"/>
+      <w:bookmarkStart w:id="3" w:name="_Toc235644759"/>
       <w:r>
         <w:t>Data understanding/EDA</w:t>
       </w:r>
@@ -1926,7 +1926,7 @@
       <w:pPr>
         <w:pStyle w:val="Heading2"/>
       </w:pPr>
-      <w:bookmarkStart w:id="4" w:name="_Toc235630417"/>
+      <w:bookmarkStart w:id="4" w:name="_Toc235644760"/>
       <w:r>
         <w:t>Dataset Overview</w:t>
       </w:r>
@@ -1969,7 +1969,7 @@
       <w:pPr>
         <w:pStyle w:val="Heading2"/>
       </w:pPr>
-      <w:bookmarkStart w:id="5" w:name="_Toc235630418"/>
+      <w:bookmarkStart w:id="5" w:name="_Toc235644761"/>
       <w:r>
         <w:lastRenderedPageBreak/>
         <w:t>Missing Data Analysis</w:t>
@@ -2155,7 +2155,7 @@
           <w:lang w:eastAsia="en-US"/>
         </w:rPr>
       </w:pPr>
-      <w:bookmarkStart w:id="6" w:name="_Toc235630419"/>
+      <w:bookmarkStart w:id="6" w:name="_Toc235644762"/>
       <w:r>
         <w:rPr>
           <w:lang w:eastAsia="en-US"/>
@@ -2267,7 +2267,7 @@
           <w:lang w:eastAsia="en-US"/>
         </w:rPr>
       </w:pPr>
-      <w:bookmarkStart w:id="7" w:name="_Toc235630420"/>
+      <w:bookmarkStart w:id="7" w:name="_Toc235644763"/>
       <w:r>
         <w:rPr>
           <w:lang w:eastAsia="en-US"/>
@@ -2392,7 +2392,7 @@
           <w:lang w:eastAsia="en-US"/>
         </w:rPr>
       </w:pPr>
-      <w:bookmarkStart w:id="8" w:name="_Toc235630421"/>
+      <w:bookmarkStart w:id="8" w:name="_Toc235644764"/>
       <w:r>
         <w:rPr>
           <w:lang w:eastAsia="en-US"/>
@@ -2518,7 +2518,7 @@
           <w:lang w:eastAsia="en-US"/>
         </w:rPr>
       </w:pPr>
-      <w:bookmarkStart w:id="9" w:name="_Toc235630422"/>
+      <w:bookmarkStart w:id="9" w:name="_Toc235644765"/>
       <w:r>
         <w:rPr>
           <w:lang w:eastAsia="en-US"/>
@@ -2638,7 +2638,7 @@
           <w:lang w:eastAsia="en-US"/>
         </w:rPr>
       </w:pPr>
-      <w:bookmarkStart w:id="10" w:name="_Toc235630423"/>
+      <w:bookmarkStart w:id="10" w:name="_Toc235644766"/>
       <w:r>
         <w:rPr>
           <w:lang w:eastAsia="en-US"/>
@@ -2800,7 +2800,7 @@
           <w:lang w:eastAsia="en-US"/>
         </w:rPr>
       </w:pPr>
-      <w:bookmarkStart w:id="11" w:name="_Toc235630424"/>
+      <w:bookmarkStart w:id="11" w:name="_Toc235644767"/>
       <w:r>
         <w:rPr>
           <w:lang w:eastAsia="en-US"/>
@@ -2945,7 +2945,7 @@
           <w:lang w:eastAsia="en-US"/>
         </w:rPr>
       </w:pPr>
-      <w:bookmarkStart w:id="12" w:name="_Toc235630425"/>
+      <w:bookmarkStart w:id="12" w:name="_Toc235644768"/>
       <w:r>
         <w:rPr>
           <w:lang w:eastAsia="en-US"/>
@@ -3065,7 +3065,7 @@
           <w:lang w:eastAsia="en-US"/>
         </w:rPr>
       </w:pPr>
-      <w:bookmarkStart w:id="13" w:name="_Toc235630426"/>
+      <w:bookmarkStart w:id="13" w:name="_Toc235644769"/>
       <w:r>
         <w:rPr>
           <w:lang w:eastAsia="en-US"/>
@@ -3081,7 +3081,7 @@
           <w:lang w:eastAsia="en-US"/>
         </w:rPr>
       </w:pPr>
-      <w:bookmarkStart w:id="14" w:name="_Toc235630427"/>
+      <w:bookmarkStart w:id="14" w:name="_Toc235644770"/>
       <w:r>
         <w:rPr>
           <w:lang w:eastAsia="en-US"/>
@@ -3180,7 +3180,7 @@
           <w:lang w:eastAsia="en-US"/>
         </w:rPr>
       </w:pPr>
-      <w:bookmarkStart w:id="15" w:name="_Toc235630428"/>
+      <w:bookmarkStart w:id="15" w:name="_Toc235644771"/>
       <w:r>
         <w:rPr>
           <w:lang w:eastAsia="en-US"/>
@@ -3281,7 +3281,7 @@
       <w:pPr>
         <w:pStyle w:val="Heading2"/>
       </w:pPr>
-      <w:bookmarkStart w:id="16" w:name="_Toc235630429"/>
+      <w:bookmarkStart w:id="16" w:name="_Toc235644772"/>
       <w:r>
         <w:lastRenderedPageBreak/>
         <w:t>Pr</w:t>
@@ -3309,7 +3309,7 @@
       <w:pPr>
         <w:pStyle w:val="Heading1"/>
       </w:pPr>
-      <w:bookmarkStart w:id="17" w:name="_Toc235630430"/>
+      <w:bookmarkStart w:id="17" w:name="_Toc235644773"/>
       <w:r>
         <w:t>Modeling</w:t>
       </w:r>
@@ -3319,56 +3319,460 @@
       <w:pPr>
         <w:pStyle w:val="Heading2"/>
       </w:pPr>
-      <w:bookmarkStart w:id="18" w:name="_Toc235630431"/>
+      <w:bookmarkStart w:id="18" w:name="_Toc235644774"/>
       <w:r>
         <w:t>Logistic Regression</w:t>
       </w:r>
       <w:bookmarkEnd w:id="18"/>
+    </w:p>
+    <w:p>
+      <w:r>
+        <w:t>A logistic regression model was used to predict if a patient</w:t>
+      </w:r>
+      <w:r>
+        <w:t xml:space="preserve"> </w:t>
+      </w:r>
+      <w:r>
+        <w:t xml:space="preserve">was found to </w:t>
+      </w:r>
+      <w:r>
+        <w:t>be positive for the presence of COVID-19 based upon</w:t>
+      </w:r>
+      <w:r>
+        <w:t xml:space="preserve"> the eight predictor variables.</w:t>
+      </w:r>
+      <w:r>
+        <w:t xml:space="preserve"> The model was</w:t>
+      </w:r>
+      <w:r>
+        <w:t xml:space="preserve"> trained using 60% of the </w:t>
+      </w:r>
+      <w:r>
+        <w:t>data</w:t>
+      </w:r>
+      <w:r>
+        <w:t xml:space="preserve">. The </w:t>
+      </w:r>
+      <w:r>
+        <w:t xml:space="preserve">remaining 40% of the data was used for the model to evaluate. </w:t>
+      </w:r>
+      <w:r>
+        <w:t>The model was accurate</w:t>
+      </w:r>
+      <w:r>
+        <w:t xml:space="preserve"> to a degree of 91.53%</w:t>
+      </w:r>
+      <w:r>
+        <w:t xml:space="preserve">. </w:t>
+      </w:r>
+      <w:r>
+        <w:t>The model’s precision was 78.96%</w:t>
+      </w:r>
+      <w:r>
+        <w:t>.</w:t>
+      </w:r>
+      <w:r>
+        <w:t xml:space="preserve"> Other notable scores from the model include</w:t>
+      </w:r>
+      <w:r>
+        <w:t xml:space="preserve"> a sensitivity of 26.26%, specificity of 99.16%, a F1-score of 0.</w:t>
+      </w:r>
+      <w:r>
+        <w:t xml:space="preserve">3987, and a ROC AUC of 0.7692. </w:t>
+      </w:r>
+      <w:r>
+        <w:t xml:space="preserve">These values showcase that the model was effective </w:t>
+      </w:r>
+      <w:r>
+        <w:t>at</w:t>
+      </w:r>
+      <w:r>
+        <w:t xml:space="preserve"> correctly </w:t>
+      </w:r>
+      <w:r>
+        <w:t>identifying</w:t>
+      </w:r>
+      <w:r>
+        <w:t xml:space="preserve"> negative cases; however, the model was not as effective at identifying positive cases.</w:t>
+      </w:r>
+      <w:r>
+        <w:t xml:space="preserve"> The poor performance in identifying positive </w:t>
+      </w:r>
+      <w:r>
+        <w:t xml:space="preserve">cases is highlighted in the low sensitivity score. </w:t>
+      </w:r>
+      <w:r>
+        <w:t>The mod</w:t>
+      </w:r>
+      <w:r>
+        <w:t xml:space="preserve">el demonstrated </w:t>
+      </w:r>
+      <w:r>
+        <w:t xml:space="preserve">a </w:t>
+      </w:r>
+      <w:r>
+        <w:t>fair discriminative ability with a ROC AUC score in the range of 0.70-0.80.</w:t>
+      </w:r>
     </w:p>
     <w:p>
       <w:pPr>
         <w:pStyle w:val="Heading2"/>
       </w:pPr>
-      <w:bookmarkStart w:id="19" w:name="_Toc235630432"/>
+      <w:bookmarkStart w:id="19" w:name="_Toc235644775"/>
       <w:r>
         <w:t>K-Nearest Neighbor</w:t>
       </w:r>
       <w:bookmarkEnd w:id="19"/>
+    </w:p>
+    <w:p>
+      <w:r>
+        <w:t>A K-Nearest Neighbors model was</w:t>
+      </w:r>
+      <w:r>
+        <w:t xml:space="preserve"> constructed using</w:t>
+      </w:r>
+      <w:r>
+        <w:t xml:space="preserve"> the 8 predictor variables </w:t>
+      </w:r>
+      <w:r>
+        <w:t xml:space="preserve">Cough, Fever, </w:t>
+      </w:r>
+      <w:proofErr w:type="spellStart"/>
+      <w:r>
+        <w:t>Sore_Throat</w:t>
+      </w:r>
+      <w:proofErr w:type="spellEnd"/>
+      <w:r>
+        <w:t xml:space="preserve">, </w:t>
+      </w:r>
+      <w:proofErr w:type="spellStart"/>
+      <w:r>
+        <w:t>Shortness_Of_Breath</w:t>
+      </w:r>
+      <w:proofErr w:type="spellEnd"/>
+      <w:r>
+        <w:t>, Headache, Age_60_And_Above, Sex, and Contact</w:t>
+      </w:r>
+      <w:r>
+        <w:t xml:space="preserve"> to develop a model that can consistently predict if a patient is likely to test positive</w:t>
+      </w:r>
+      <w:r>
+        <w:t xml:space="preserve"> for COVID-19.</w:t>
+      </w:r>
+      <w:r>
+        <w:t xml:space="preserve"> </w:t>
+      </w:r>
+      <w:r>
+        <w:t>A sample size of 50,000 was us</w:t>
+      </w:r>
+      <w:r>
+        <w:t xml:space="preserve">ed </w:t>
+      </w:r>
+      <w:r>
+        <w:t xml:space="preserve">since the KNN algorithm is computationally </w:t>
+      </w:r>
+      <w:r>
+        <w:t>expensive</w:t>
+      </w:r>
+      <w:r>
+        <w:t xml:space="preserve"> and the dataset is very large containing over one million entries. </w:t>
+      </w:r>
+      <w:r>
+        <w:t xml:space="preserve">The data was divided into two sets. </w:t>
+      </w:r>
+      <w:r>
+        <w:t xml:space="preserve">The </w:t>
+      </w:r>
+      <w:r>
+        <w:lastRenderedPageBreak/>
+        <w:t xml:space="preserve">training set </w:t>
+      </w:r>
+      <w:r>
+        <w:t xml:space="preserve">contained 60% of the data and the </w:t>
+      </w:r>
+      <w:r>
+        <w:t>testing set contained the remaining 40%.</w:t>
+      </w:r>
+      <w:r>
+        <w:t xml:space="preserve"> </w:t>
+      </w:r>
+      <w:r>
+        <w:t xml:space="preserve">A 10-fold cross-validation was </w:t>
+      </w:r>
+      <w:r>
+        <w:t>performed</w:t>
+      </w:r>
+      <w:r>
+        <w:t xml:space="preserve"> to determine the </w:t>
+      </w:r>
+      <w:r>
+        <w:t>optimal value of k to be 12.</w:t>
+      </w:r>
+      <w:r>
+        <w:t xml:space="preserve"> </w:t>
+      </w:r>
+      <w:r>
+        <w:t xml:space="preserve">The KNN model produced the following results: accuracy of 91.75%, precision of 68.47%, sensitivity </w:t>
+      </w:r>
+      <w:r>
+        <w:t>of 40.22%, F1 of 0.5067, and a ROC AUC of 0.7681.</w:t>
+      </w:r>
+      <w:r>
+        <w:t xml:space="preserve"> </w:t>
+      </w:r>
+      <w:r>
+        <w:t xml:space="preserve">Based on the results, the model was </w:t>
+      </w:r>
+      <w:r>
+        <w:t>effective a</w:t>
+      </w:r>
+      <w:r>
+        <w:t>t</w:t>
+      </w:r>
+      <w:r>
+        <w:t xml:space="preserve"> identifying </w:t>
+      </w:r>
+      <w:r>
+        <w:t>cases where the patient tested</w:t>
+      </w:r>
+      <w:r>
+        <w:t xml:space="preserve"> negative; however, the model was not as effective at identifying </w:t>
+      </w:r>
+      <w:r>
+        <w:t>positive cases.</w:t>
+      </w:r>
     </w:p>
     <w:p>
       <w:pPr>
         <w:pStyle w:val="Heading1"/>
       </w:pPr>
-      <w:bookmarkStart w:id="20" w:name="_Toc235630433"/>
+      <w:bookmarkStart w:id="20" w:name="_Toc235644776"/>
       <w:r>
         <w:t>Evaluation</w:t>
       </w:r>
       <w:bookmarkEnd w:id="20"/>
+    </w:p>
+    <w:p>
+      <w:r>
+        <w:t>Two classification models were developed with the purpose of predicting if a patient would likely test positive for COVID-19.</w:t>
+      </w:r>
+      <w:r>
+        <w:t xml:space="preserve"> Both </w:t>
+      </w:r>
+      <w:r>
+        <w:t>the Logistic Regression and K-Nearest Neighbors mod</w:t>
+      </w:r>
+      <w:r>
+        <w:t xml:space="preserve">els were trained </w:t>
+      </w:r>
+      <w:r>
+        <w:t>and tested using the same proportion of data.</w:t>
+      </w:r>
+      <w:r>
+        <w:t xml:space="preserve"> </w:t>
+      </w:r>
+      <w:r>
+        <w:t>The model</w:t>
+      </w:r>
+      <w:r>
+        <w:t xml:space="preserve"> </w:t>
+      </w:r>
+      <w:r>
+        <w:t>performance evaluation focused on criteria including ROC AUC</w:t>
+      </w:r>
+      <w:r>
+        <w:t xml:space="preserve">, </w:t>
+      </w:r>
+      <w:r>
+        <w:t>accuracy</w:t>
+      </w:r>
+      <w:r>
+        <w:t>, and precision to name a few.</w:t>
+      </w:r>
+      <w:r>
+        <w:t xml:space="preserve"> </w:t>
+      </w:r>
+      <w:r>
+        <w:t xml:space="preserve">Both models performed very similarly. The difference in </w:t>
+      </w:r>
+      <w:r>
+        <w:t>accuracy was only 0.22% favoring the KNN model.</w:t>
+      </w:r>
+      <w:r>
+        <w:t xml:space="preserve"> The difference in ROC AUC values</w:t>
+      </w:r>
+      <w:r>
+        <w:t xml:space="preserve"> was less than 0.002.</w:t>
+      </w:r>
+      <w:r>
+        <w:t xml:space="preserve"> This indicates that both models were nearly identical in their ability to </w:t>
+      </w:r>
+      <w:r>
+        <w:t xml:space="preserve">correctly identify </w:t>
+      </w:r>
+      <w:r>
+        <w:t>positive and negative cases.</w:t>
+      </w:r>
+      <w:r>
+        <w:t xml:space="preserve"> </w:t>
+      </w:r>
+      <w:r>
+        <w:t>Based solely on these metrics, neither model demonstrated an edge in performance.</w:t>
+      </w:r>
+    </w:p>
+    <w:p>
+      <w:r>
+        <w:t xml:space="preserve">The primary gaps in performance between the models </w:t>
+      </w:r>
+      <w:r>
+        <w:t xml:space="preserve">existed in their precision and sensitivity. </w:t>
+      </w:r>
+      <w:r>
+        <w:t xml:space="preserve">The Logistic Regression model led with a higher precision of 78.96% versus the KNN model’s </w:t>
+      </w:r>
+      <w:r>
+        <w:t>68.47%.</w:t>
+      </w:r>
+      <w:r>
+        <w:t xml:space="preserve"> This value indicates the Logistic Regression model was more likely to </w:t>
+      </w:r>
+      <w:r>
+        <w:t xml:space="preserve">be correct when </w:t>
+      </w:r>
+      <w:r>
+        <w:t>identify</w:t>
+      </w:r>
+      <w:r>
+        <w:t>ing</w:t>
+      </w:r>
+      <w:r>
+        <w:t xml:space="preserve"> a positive case</w:t>
+      </w:r>
+      <w:r>
+        <w:t xml:space="preserve"> compared to the KNN model.</w:t>
+      </w:r>
+      <w:r>
+        <w:t xml:space="preserve"> </w:t>
+      </w:r>
+      <w:r>
+        <w:t xml:space="preserve">However, the KNN </w:t>
+      </w:r>
+      <w:r>
+        <w:t>model had a higher sensitivity of 40.22% versus the Logistic Regression model’s 26.67%.</w:t>
+      </w:r>
+      <w:r>
+        <w:t xml:space="preserve"> </w:t>
+      </w:r>
+      <w:r>
+        <w:t>This indicates the KNN model</w:t>
+      </w:r>
+      <w:r>
+        <w:t xml:space="preserve"> correctly identified about 51% more positive cases</w:t>
+      </w:r>
+      <w:r>
+        <w:t xml:space="preserve"> compared to the other model.</w:t>
+      </w:r>
+      <w:r>
+        <w:t xml:space="preserve"> </w:t>
+      </w:r>
+      <w:r>
+        <w:t xml:space="preserve">The KNN </w:t>
+      </w:r>
+      <w:r>
+        <w:t>also had a better F1-score which means</w:t>
+      </w:r>
+      <w:r>
+        <w:t xml:space="preserve"> the model also had a </w:t>
+      </w:r>
+      <w:r>
+        <w:t>better balance between</w:t>
+      </w:r>
+      <w:r>
+        <w:t xml:space="preserve"> precision and </w:t>
+      </w:r>
+      <w:r>
+        <w:t xml:space="preserve">sensitivity. </w:t>
+      </w:r>
+    </w:p>
+    <w:p>
+      <w:r>
+        <w:lastRenderedPageBreak/>
+        <w:t>The K-Nearest Neighbors model outperformed the Logistic Regression model</w:t>
+      </w:r>
+      <w:r>
+        <w:t>.</w:t>
+      </w:r>
+      <w:r>
+        <w:t xml:space="preserve"> Based on their metrics</w:t>
+      </w:r>
+      <w:r>
+        <w:t>, the KNN model</w:t>
+      </w:r>
+      <w:r>
+        <w:t xml:space="preserve"> is the better model for the COVID-19 dataset. </w:t>
+      </w:r>
+      <w:r>
+        <w:t>The Logistic Regression model did have fewer false positives</w:t>
+      </w:r>
+      <w:r>
+        <w:t xml:space="preserve">; however, the KNN model’s better sensitivity </w:t>
+      </w:r>
+      <w:r>
+        <w:t>makes</w:t>
+      </w:r>
+      <w:r>
+        <w:t xml:space="preserve"> it the </w:t>
+      </w:r>
+      <w:r>
+        <w:t>optimal choice for</w:t>
+      </w:r>
+      <w:r>
+        <w:t xml:space="preserve"> identifying </w:t>
+      </w:r>
+      <w:r>
+        <w:t>infected patients.</w:t>
+      </w:r>
+    </w:p>
+    <w:p>
+      <w:pPr>
+        <w:pStyle w:val="Heading1"/>
+        <w:rPr>
+          <w:shd w:val="clear" w:color="auto" w:fill="FFFFFF"/>
+        </w:rPr>
+      </w:pPr>
+      <w:bookmarkStart w:id="21" w:name="_Toc235644777"/>
+      <w:r>
+        <w:rPr>
+          <w:shd w:val="clear" w:color="auto" w:fill="FFFFFF"/>
+        </w:rPr>
+        <w:t>Deployment</w:t>
+      </w:r>
+      <w:bookmarkEnd w:id="21"/>
+    </w:p>
+    <w:p>
+      <w:r>
+        <w:t xml:space="preserve">The results of the KNN model can be extrapolated to support decisions made in the healthcare sector. From the exploratory data analysis, contact with a person who was diagnosed as having COVID-19 was the strongest predictor variable in determining if a person would also test positive. Symptoms of headaches and fever had the strongest positive correlation with positive test results. Healthcare professionals can use this information to pay extra attention to patients exhibiting these two symptoms. </w:t>
+      </w:r>
+    </w:p>
+    <w:p>
+      <w:r>
+        <w:t>The models showed that the symptom data can be a useful guide to determine if someone is likely to test positive but not definitive. Both models achieved a similar accuracy at approximately 91% but neither accomplished identifying all positive cases. From these results, laboratory testing still proves vital in confirming the final diagnosis.</w:t>
+      </w:r>
+      <w:r>
+        <w:t xml:space="preserve"> The models should not replace laboratory testing. Instead, the models could be used to identify patients likely to test positive in order to isolate individuals until additional testing can be done or in times of limited resources. </w:t>
+      </w:r>
     </w:p>
     <w:p>
       <w:pPr>
         <w:pStyle w:val="Heading1"/>
       </w:pPr>
-      <w:bookmarkStart w:id="21" w:name="_Toc235630434"/>
-      <w:r>
-        <w:rPr>
-          <w:shd w:val="clear" w:color="auto" w:fill="FFFFFF"/>
-        </w:rPr>
-        <w:t>Deployment</w:t>
-      </w:r>
-      <w:bookmarkEnd w:id="21"/>
-    </w:p>
-    <w:p>
-      <w:pPr>
-        <w:pStyle w:val="Heading1"/>
-      </w:pPr>
-      <w:bookmarkStart w:id="22" w:name="_Toc235630435"/>
+      <w:bookmarkStart w:id="22" w:name="_Toc235644778"/>
       <w:r>
         <w:t>Conclusion</w:t>
       </w:r>
       <w:bookmarkEnd w:id="22"/>
     </w:p>
-    <w:bookmarkStart w:id="23" w:name="_Toc235630436" w:displacedByCustomXml="next"/>
+    <w:bookmarkStart w:id="23" w:name="_Toc235644779" w:displacedByCustomXml="next"/>
     <w:sdt>
       <w:sdtPr>
         <w:rPr>
@@ -7473,6 +7877,6 @@
 
 <file path=docMetadata/LabelInfo.xml><?xml version="1.0" encoding="utf-8"?>
 <clbl:labelList xmlns:clbl="http://schemas.microsoft.com/office/2020/mipLabelMetadata">
-  <clbl:label id="{37f4b8a2-ad4f-41b5-9a91-284d2cc38f56}" enabled="1" method="Standard" siteId="{70de1992-07c6-480f-a318-a1afcba03983}" contentBits="0" removed="0"/>
+  <clbl:label id="{37f4b8a2-ad4f-41b5-9a91-284d2cc38f56}" enabled="1" method="Privileged" siteId="{70de1992-07c6-480f-a318-a1afcba03983}" contentBits="0" removed="0"/>
 </clbl:labelList>
 </file>
</xml_diff>